<commit_message>
fixed import si calcserv, se salveaza in dtb YFR
</commit_message>
<xml_diff>
--- a/SolomonLorena_ProgresDemo2.docx
+++ b/SolomonLorena_ProgresDemo2.docx
@@ -14339,7 +14339,17 @@
           <w:szCs w:val="19"/>
           <w:highlight w:val="white"/>
         </w:rPr>
-        <w:t xml:space="preserve">***?? </w:t>
+        <w:t>***</w:t>
+      </w:r>
+      <w:r>
+        <w:rPr>
+          <w:rFonts w:ascii="Cascadia Mono" w:hAnsi="Cascadia Mono" w:cs="Cascadia Mono"/>
+          <w:color w:val="000000"/>
+          <w:sz w:val="19"/>
+          <w:szCs w:val="19"/>
+          <w:highlight w:val="white"/>
+        </w:rPr>
+        <w:t xml:space="preserve"> </w:t>
       </w:r>
       <w:hyperlink r:id="rId23" w:history="1">
         <w:r>
@@ -14361,8 +14371,6 @@
         </w:rPr>
         <w:t xml:space="preserve"> </w:t>
       </w:r>
-      <w:bookmarkStart w:id="0" w:name="_GoBack"/>
-      <w:bookmarkEnd w:id="0"/>
     </w:p>
     <w:p>
       <w:pPr>
@@ -14393,21 +14401,7 @@
           <w:rFonts w:ascii="Times New Roman" w:hAnsi="Times New Roman" w:cs="Times New Roman"/>
           <w:sz w:val="28"/>
         </w:rPr>
-        <w:t>meto</w:t>
-      </w:r>
-      <w:r>
-        <w:rPr>
-          <w:rFonts w:ascii="Times New Roman" w:hAnsi="Times New Roman" w:cs="Times New Roman"/>
-          <w:sz w:val="28"/>
-        </w:rPr>
-        <w:t>da</w:t>
-      </w:r>
-      <w:r>
-        <w:rPr>
-          <w:rFonts w:ascii="Times New Roman" w:hAnsi="Times New Roman" w:cs="Times New Roman"/>
-          <w:sz w:val="28"/>
-        </w:rPr>
-        <w:t xml:space="preserve"> CalculateKpi</w:t>
+        <w:t>metoda CalculateKpi</w:t>
       </w:r>
       <w:r>
         <w:rPr>
@@ -14504,7 +14498,7 @@
         <w:pStyle w:val="Heading1"/>
       </w:pPr>
       <w:r>
-        <w:t>Scenariul modelat stil APSI</w:t>
+        <w:t>Scenariul modelat APSI</w:t>
       </w:r>
     </w:p>
     <w:p>
@@ -14532,7 +14526,13 @@
         <w:rPr>
           <w:b w:val="0"/>
         </w:rPr>
-        <w:t>) Scenariul modelat (Fluxul de proces)</w:t>
+        <w:t xml:space="preserve">) </w:t>
+      </w:r>
+      <w:r>
+        <w:rPr>
+          <w:b w:val="0"/>
+        </w:rPr>
+        <w:t>Fluxul de proces</w:t>
       </w:r>
     </w:p>
     <w:p>
@@ -14552,7 +14552,7 @@
           <w:szCs w:val="24"/>
           <w:lang w:eastAsia="en-GB"/>
         </w:rPr>
-        <w:t xml:space="preserve">Scenariul modelat </w:t>
+        <w:t xml:space="preserve">Utilizatorul (care are rolul de analist financiar sau manager) accesează pagina principală </w:t>
       </w:r>
       <w:proofErr w:type="gramStart"/>
       <w:r>
@@ -14562,7 +14562,7 @@
           <w:szCs w:val="24"/>
           <w:lang w:eastAsia="en-GB"/>
         </w:rPr>
-        <w:t>este</w:t>
+        <w:t>a</w:t>
       </w:r>
       <w:proofErr w:type="gramEnd"/>
       <w:r>
@@ -14572,7 +14572,7 @@
           <w:szCs w:val="24"/>
           <w:lang w:eastAsia="en-GB"/>
         </w:rPr>
-        <w:t xml:space="preserve"> următorul: Utilizatorul (care are rolul de analist financiar sau manager) accesează pagina principală a aplicației (Index - „Bine ați venit”). Aici, procesul se desparte printr-o decizie (Gateway Exclusiv) în funcție de statutul utilizatorului: </w:t>
+        <w:t xml:space="preserve"> aplicației (Index - „Bine ați venit”). </w:t>
       </w:r>
       <w:proofErr w:type="gramStart"/>
       <w:r>
@@ -14582,18 +14582,18 @@
           <w:szCs w:val="24"/>
           <w:lang w:eastAsia="en-GB"/>
         </w:rPr>
-        <w:t>este</w:t>
+        <w:t>Aici, procesul se desparte printr-o decizie în funcție de statutul utilizatorului</w:t>
+      </w:r>
+      <w:r>
+        <w:rPr>
+          <w:rFonts w:ascii="Times New Roman" w:eastAsia="Times New Roman" w:hAnsi="Times New Roman" w:cs="Times New Roman"/>
+          <w:sz w:val="24"/>
+          <w:szCs w:val="24"/>
+          <w:lang w:eastAsia="en-GB"/>
+        </w:rPr>
+        <w:t>.</w:t>
       </w:r>
       <w:proofErr w:type="gramEnd"/>
-      <w:r>
-        <w:rPr>
-          <w:rFonts w:ascii="Times New Roman" w:eastAsia="Times New Roman" w:hAnsi="Times New Roman" w:cs="Times New Roman"/>
-          <w:sz w:val="24"/>
-          <w:szCs w:val="24"/>
-          <w:lang w:eastAsia="en-GB"/>
-        </w:rPr>
-        <w:t xml:space="preserve"> un utilizator nou sau unul existent?</w:t>
-      </w:r>
     </w:p>
     <w:p>
       <w:pPr>
@@ -14712,7 +14712,79 @@
           <w:szCs w:val="24"/>
           <w:lang w:eastAsia="en-GB"/>
         </w:rPr>
-        <w:t xml:space="preserve"> cont (Register). După validarea și crearea contului, sistemul îl îndrumă automat către primul pas obligatoriu de configurare: definirea profilului entității analizate (Creare Firmă). Utilizatorul introduce datele de identificare ale companiei (Nume, CUI, CAEN etc.). După salvarea cu succes a companiei în baza de date, procesul curge către etapa de ingestie a datelor (Import File). Aici, utilizatorul selectează și încarcă </w:t>
+        <w:t xml:space="preserve"> cont (Register). După validarea și crearea contului, sistemul îl îndrumă automat către primul pas obligatoriu de configurare: definirea profilului (Creare Firmă). Utilizatorul introduce datele de identificare ale companiei (Nume, CUI, CAEN etc.). După salvarea cu succes a companiei în baza de date, procesul </w:t>
+      </w:r>
+      <w:r>
+        <w:rPr>
+          <w:rFonts w:ascii="Times New Roman" w:eastAsia="Times New Roman" w:hAnsi="Times New Roman" w:cs="Times New Roman"/>
+          <w:sz w:val="24"/>
+          <w:szCs w:val="24"/>
+          <w:lang w:eastAsia="en-GB"/>
+        </w:rPr>
+        <w:t>continua</w:t>
+      </w:r>
+      <w:r>
+        <w:rPr>
+          <w:rFonts w:ascii="Times New Roman" w:eastAsia="Times New Roman" w:hAnsi="Times New Roman" w:cs="Times New Roman"/>
+          <w:sz w:val="24"/>
+          <w:szCs w:val="24"/>
+          <w:lang w:eastAsia="en-GB"/>
+        </w:rPr>
+        <w:t xml:space="preserve"> către etapa de </w:t>
+      </w:r>
+      <w:r>
+        <w:rPr>
+          <w:rFonts w:ascii="Times New Roman" w:eastAsia="Times New Roman" w:hAnsi="Times New Roman" w:cs="Times New Roman"/>
+          <w:sz w:val="24"/>
+          <w:szCs w:val="24"/>
+          <w:lang w:eastAsia="en-GB"/>
+        </w:rPr>
+        <w:t>upload</w:t>
+      </w:r>
+      <w:r>
+        <w:rPr>
+          <w:rFonts w:ascii="Times New Roman" w:eastAsia="Times New Roman" w:hAnsi="Times New Roman" w:cs="Times New Roman"/>
+          <w:sz w:val="24"/>
+          <w:szCs w:val="24"/>
+          <w:lang w:eastAsia="en-GB"/>
+        </w:rPr>
+        <w:t xml:space="preserve"> a</w:t>
+      </w:r>
+      <w:r>
+        <w:rPr>
+          <w:rFonts w:ascii="Times New Roman" w:eastAsia="Times New Roman" w:hAnsi="Times New Roman" w:cs="Times New Roman"/>
+          <w:sz w:val="24"/>
+          <w:szCs w:val="24"/>
+          <w:lang w:eastAsia="en-GB"/>
+        </w:rPr>
+        <w:t>l</w:t>
+      </w:r>
+      <w:r>
+        <w:rPr>
+          <w:rFonts w:ascii="Times New Roman" w:eastAsia="Times New Roman" w:hAnsi="Times New Roman" w:cs="Times New Roman"/>
+          <w:sz w:val="24"/>
+          <w:szCs w:val="24"/>
+          <w:lang w:eastAsia="en-GB"/>
+        </w:rPr>
+        <w:t xml:space="preserve"> datelor (</w:t>
+      </w:r>
+      <w:r>
+        <w:rPr>
+          <w:rFonts w:ascii="Times New Roman" w:eastAsia="Times New Roman" w:hAnsi="Times New Roman" w:cs="Times New Roman"/>
+          <w:sz w:val="24"/>
+          <w:szCs w:val="24"/>
+          <w:lang w:eastAsia="en-GB"/>
+        </w:rPr>
+        <w:t xml:space="preserve">Creare </w:t>
+      </w:r>
+      <w:r>
+        <w:rPr>
+          <w:rFonts w:ascii="Times New Roman" w:eastAsia="Times New Roman" w:hAnsi="Times New Roman" w:cs="Times New Roman"/>
+          <w:sz w:val="24"/>
+          <w:szCs w:val="24"/>
+          <w:lang w:eastAsia="en-GB"/>
+        </w:rPr>
+        <w:t xml:space="preserve">Import). Aici, utilizatorul selectează și încarcă </w:t>
       </w:r>
       <w:proofErr w:type="gramStart"/>
       <w:r>
@@ -14771,8 +14843,34 @@
           <w:szCs w:val="24"/>
           <w:lang w:eastAsia="en-GB"/>
         </w:rPr>
-        <w:lastRenderedPageBreak/>
-        <w:t xml:space="preserve">Odată declanșat importul, controlul trece în </w:t>
+        <w:t xml:space="preserve">Odată </w:t>
+      </w:r>
+      <w:r>
+        <w:rPr>
+          <w:rFonts w:ascii="Times New Roman" w:eastAsia="Times New Roman" w:hAnsi="Times New Roman" w:cs="Times New Roman"/>
+          <w:sz w:val="24"/>
+          <w:szCs w:val="24"/>
+          <w:lang w:eastAsia="en-GB"/>
+        </w:rPr>
+        <w:t>trimis</w:t>
+      </w:r>
+      <w:r>
+        <w:rPr>
+          <w:rFonts w:ascii="Times New Roman" w:eastAsia="Times New Roman" w:hAnsi="Times New Roman" w:cs="Times New Roman"/>
+          <w:sz w:val="24"/>
+          <w:szCs w:val="24"/>
+          <w:lang w:eastAsia="en-GB"/>
+        </w:rPr>
+        <w:t xml:space="preserve"> importul, controlul trece în </w:t>
+      </w:r>
+      <w:r>
+        <w:rPr>
+          <w:rFonts w:ascii="Times New Roman" w:eastAsia="Times New Roman" w:hAnsi="Times New Roman" w:cs="Times New Roman"/>
+          <w:sz w:val="24"/>
+          <w:szCs w:val="24"/>
+          <w:lang w:eastAsia="en-GB"/>
+        </w:rPr>
+        <w:t>b</w:t>
       </w:r>
       <w:r>
         <w:rPr>
@@ -14782,7 +14880,7 @@
           <w:szCs w:val="24"/>
           <w:lang w:eastAsia="en-GB"/>
         </w:rPr>
-        <w:t>Lane-ul Sistemului (Backend)</w:t>
+        <w:t>ackend</w:t>
       </w:r>
       <w:r>
         <w:rPr>
@@ -14801,7 +14899,7 @@
           <w:szCs w:val="24"/>
           <w:lang w:eastAsia="en-GB"/>
         </w:rPr>
-        <w:t xml:space="preserve"> Sistemul execută o secvență de operații automate:</w:t>
+        <w:t xml:space="preserve"> Sistemul execută o secvență de operații:</w:t>
       </w:r>
     </w:p>
     <w:p>
@@ -14825,6 +14923,7 @@
           <w:szCs w:val="24"/>
           <w:lang w:eastAsia="en-GB"/>
         </w:rPr>
+        <w:lastRenderedPageBreak/>
         <w:t>Citește și validează structura fișierului.</w:t>
       </w:r>
     </w:p>
@@ -14858,7 +14957,7 @@
           <w:szCs w:val="20"/>
           <w:lang w:eastAsia="en-GB"/>
         </w:rPr>
-        <w:t>YearlyFinancialReport</w:t>
+        <w:t>YFR</w:t>
       </w:r>
       <w:r>
         <w:rPr>
@@ -14911,7 +15010,7 @@
           <w:szCs w:val="24"/>
           <w:lang w:eastAsia="en-GB"/>
         </w:rPr>
-        <w:t xml:space="preserve"> serviciu intern de calcul (</w:t>
+        <w:t xml:space="preserve"> serviciu de calcul (</w:t>
       </w:r>
       <w:r>
         <w:rPr>
@@ -14929,7 +15028,25 @@
           <w:szCs w:val="24"/>
           <w:lang w:eastAsia="en-GB"/>
         </w:rPr>
-        <w:t>) care iterează prin datele anuale și generează automat KPI-urile financiari complecși (ROA, ROE, Marja de profit, Ratele de creștere YoY).</w:t>
+        <w:t>) care iterează prin datele anuale și generea</w:t>
+      </w:r>
+      <w:r>
+        <w:rPr>
+          <w:rFonts w:ascii="Times New Roman" w:eastAsia="Times New Roman" w:hAnsi="Times New Roman" w:cs="Times New Roman"/>
+          <w:sz w:val="24"/>
+          <w:szCs w:val="24"/>
+          <w:lang w:eastAsia="en-GB"/>
+        </w:rPr>
+        <w:t xml:space="preserve">ză automat KPI-urile financiare </w:t>
+      </w:r>
+      <w:r>
+        <w:rPr>
+          <w:rFonts w:ascii="Times New Roman" w:eastAsia="Times New Roman" w:hAnsi="Times New Roman" w:cs="Times New Roman"/>
+          <w:sz w:val="24"/>
+          <w:szCs w:val="24"/>
+          <w:lang w:eastAsia="en-GB"/>
+        </w:rPr>
+        <w:t>(ROA, ROE, Marja de profit, Ratele de creștere YoY).</w:t>
       </w:r>
     </w:p>
     <w:p>
@@ -14973,7 +15090,25 @@
           <w:szCs w:val="24"/>
           <w:lang w:eastAsia="en-GB"/>
         </w:rPr>
-        <w:t xml:space="preserve">La finalizarea cu succes a procesului de sistem, utilizatorul </w:t>
+        <w:t xml:space="preserve">La finalizarea </w:t>
+      </w:r>
+      <w:r>
+        <w:rPr>
+          <w:rFonts w:ascii="Times New Roman" w:eastAsia="Times New Roman" w:hAnsi="Times New Roman" w:cs="Times New Roman"/>
+          <w:sz w:val="24"/>
+          <w:szCs w:val="24"/>
+          <w:lang w:eastAsia="en-GB"/>
+        </w:rPr>
+        <w:t>cu succes a procesului</w:t>
+      </w:r>
+      <w:r>
+        <w:rPr>
+          <w:rFonts w:ascii="Times New Roman" w:eastAsia="Times New Roman" w:hAnsi="Times New Roman" w:cs="Times New Roman"/>
+          <w:sz w:val="24"/>
+          <w:szCs w:val="24"/>
+          <w:lang w:eastAsia="en-GB"/>
+        </w:rPr>
+        <w:t xml:space="preserve">, utilizatorul </w:t>
       </w:r>
       <w:proofErr w:type="gramStart"/>
       <w:r>
@@ -14994,28 +15129,6 @@
           <w:lang w:eastAsia="en-GB"/>
         </w:rPr>
         <w:t xml:space="preserve"> redirecționat către Dashboard, unde va putea explora graficele și rapoartele vizuale generate pe baza datelor tocmai procesate.</w:t>
-      </w:r>
-    </w:p>
-    <w:p>
-      <w:pPr>
-        <w:spacing w:after="0" w:line="240" w:lineRule="auto"/>
-        <w:rPr>
-          <w:rFonts w:ascii="Times New Roman" w:eastAsia="Times New Roman" w:hAnsi="Times New Roman" w:cs="Times New Roman"/>
-          <w:sz w:val="24"/>
-          <w:szCs w:val="24"/>
-          <w:lang w:eastAsia="en-GB"/>
-        </w:rPr>
-      </w:pPr>
-      <w:r>
-        <w:rPr>
-          <w:rFonts w:ascii="Times New Roman" w:eastAsia="Times New Roman" w:hAnsi="Times New Roman" w:cs="Times New Roman"/>
-          <w:sz w:val="24"/>
-          <w:szCs w:val="24"/>
-          <w:lang w:eastAsia="en-GB"/>
-        </w:rPr>
-        <w:pict>
-          <v:rect id="_x0000_i1025" style="width:0;height:1.5pt" o:hralign="center" o:hrstd="t" o:hr="t" fillcolor="#a0a0a0" stroked="f"/>
-        </w:pict>
       </w:r>
     </w:p>
     <w:p>
@@ -15060,7 +15173,7 @@
           <w:szCs w:val="27"/>
           <w:lang w:eastAsia="en-GB"/>
         </w:rPr>
-        <w:t>) Adăugarea excepțiilor și compensărilor (Tratarea erorilor în BPMN)</w:t>
+        <w:t xml:space="preserve">) Adăugarea excepțiilor </w:t>
       </w:r>
     </w:p>
     <w:p>
@@ -15073,6 +15186,7 @@
           <w:lang w:eastAsia="en-GB"/>
         </w:rPr>
       </w:pPr>
+      <w:proofErr w:type="gramStart"/>
       <w:r>
         <w:rPr>
           <w:rFonts w:ascii="Times New Roman" w:eastAsia="Times New Roman" w:hAnsi="Times New Roman" w:cs="Times New Roman"/>
@@ -15080,8 +15194,18 @@
           <w:szCs w:val="24"/>
           <w:lang w:eastAsia="en-GB"/>
         </w:rPr>
-        <w:t>Diferențe față de fluxul anterior: Ne concentrăm pe documentarea procedurilor de tratare a finalurilor nesatisfăcătoare, erorilor de date și acțiunilor de anulare (rollback) în timpul ingestiei și calculului.</w:t>
-      </w:r>
+        <w:t>Diferențe față de fluxul anterior</w:t>
+      </w:r>
+      <w:r>
+        <w:rPr>
+          <w:rFonts w:ascii="Times New Roman" w:eastAsia="Times New Roman" w:hAnsi="Times New Roman" w:cs="Times New Roman"/>
+          <w:sz w:val="24"/>
+          <w:szCs w:val="24"/>
+          <w:lang w:eastAsia="en-GB"/>
+        </w:rPr>
+        <w:t>.</w:t>
+      </w:r>
+      <w:proofErr w:type="gramEnd"/>
     </w:p>
     <w:p>
       <w:pPr>
@@ -15367,32 +15491,10 @@
           <w:szCs w:val="24"/>
           <w:lang w:eastAsia="en-GB"/>
         </w:rPr>
-        <w:t>3. Eroare de sistem la salvare (Final cu compensare / Rollback):</w:t>
-      </w:r>
-      <w:r>
-        <w:rPr>
-          <w:rFonts w:ascii="Times New Roman" w:eastAsia="Times New Roman" w:hAnsi="Times New Roman" w:cs="Times New Roman"/>
-          <w:sz w:val="24"/>
-          <w:szCs w:val="24"/>
-          <w:lang w:eastAsia="en-GB"/>
-        </w:rPr>
-        <w:t xml:space="preserve"> Calculele s-au efectuat cu succes, dar în momentul în care sistemul încearcă să salveze cele 10 rapoarte anuale în baza de date, conexiunea la serverul SQL pică sau se salvează doar primele 5 rânduri.</w:t>
-      </w:r>
-    </w:p>
-    <w:p>
-      <w:pPr>
-        <w:numPr>
-          <w:ilvl w:val="0"/>
-          <w:numId w:val="14"/>
-        </w:numPr>
-        <w:spacing w:before="100" w:beforeAutospacing="1" w:after="100" w:afterAutospacing="1" w:line="240" w:lineRule="auto"/>
-        <w:rPr>
-          <w:rFonts w:ascii="Times New Roman" w:eastAsia="Times New Roman" w:hAnsi="Times New Roman" w:cs="Times New Roman"/>
-          <w:sz w:val="24"/>
-          <w:szCs w:val="24"/>
-          <w:lang w:eastAsia="en-GB"/>
-        </w:rPr>
-      </w:pPr>
+        <w:t>3</w:t>
+      </w:r>
+      <w:bookmarkStart w:id="0" w:name="_GoBack"/>
+      <w:bookmarkEnd w:id="0"/>
       <w:r>
         <w:rPr>
           <w:rFonts w:ascii="Times New Roman" w:eastAsia="Times New Roman" w:hAnsi="Times New Roman" w:cs="Times New Roman"/>
@@ -15401,76 +15503,7 @@
           <w:szCs w:val="24"/>
           <w:lang w:eastAsia="en-GB"/>
         </w:rPr>
-        <w:t>Compensare:</w:t>
-      </w:r>
-      <w:r>
-        <w:rPr>
-          <w:rFonts w:ascii="Times New Roman" w:eastAsia="Times New Roman" w:hAnsi="Times New Roman" w:cs="Times New Roman"/>
-          <w:sz w:val="24"/>
-          <w:szCs w:val="24"/>
-          <w:lang w:eastAsia="en-GB"/>
-        </w:rPr>
-        <w:t xml:space="preserve"> Sistemul detectează tranzacția eșuată și declanșează automat acțiunea de anulare (Rollback). Toate rândurile parțial salvate asociate acelui </w:t>
-      </w:r>
-      <w:r>
-        <w:rPr>
-          <w:rFonts w:ascii="Courier New" w:eastAsia="Times New Roman" w:hAnsi="Courier New" w:cs="Courier New"/>
-          <w:sz w:val="20"/>
-          <w:szCs w:val="20"/>
-          <w:lang w:eastAsia="en-GB"/>
-        </w:rPr>
-        <w:t>ImportId</w:t>
-      </w:r>
-      <w:r>
-        <w:rPr>
-          <w:rFonts w:ascii="Times New Roman" w:eastAsia="Times New Roman" w:hAnsi="Times New Roman" w:cs="Times New Roman"/>
-          <w:sz w:val="24"/>
-          <w:szCs w:val="24"/>
-          <w:lang w:eastAsia="en-GB"/>
-        </w:rPr>
-        <w:t xml:space="preserve"> sunt șterse din baza de date pentru a preveni coruperea analizelor viitoare. Utilizatorul </w:t>
-      </w:r>
-      <w:proofErr w:type="gramStart"/>
-      <w:r>
-        <w:rPr>
-          <w:rFonts w:ascii="Times New Roman" w:eastAsia="Times New Roman" w:hAnsi="Times New Roman" w:cs="Times New Roman"/>
-          <w:sz w:val="24"/>
-          <w:szCs w:val="24"/>
-          <w:lang w:eastAsia="en-GB"/>
-        </w:rPr>
-        <w:t>este</w:t>
-      </w:r>
-      <w:proofErr w:type="gramEnd"/>
-      <w:r>
-        <w:rPr>
-          <w:rFonts w:ascii="Times New Roman" w:eastAsia="Times New Roman" w:hAnsi="Times New Roman" w:cs="Times New Roman"/>
-          <w:sz w:val="24"/>
-          <w:szCs w:val="24"/>
-          <w:lang w:eastAsia="en-GB"/>
-        </w:rPr>
-        <w:t xml:space="preserve"> notificat că importul a eșuat din motive tehnice și este rugat să reîncerce.</w:t>
-      </w:r>
-    </w:p>
-    <w:p>
-      <w:pPr>
-        <w:spacing w:before="100" w:beforeAutospacing="1" w:after="100" w:afterAutospacing="1" w:line="240" w:lineRule="auto"/>
-        <w:rPr>
-          <w:rFonts w:ascii="Times New Roman" w:eastAsia="Times New Roman" w:hAnsi="Times New Roman" w:cs="Times New Roman"/>
-          <w:sz w:val="24"/>
-          <w:szCs w:val="24"/>
-          <w:lang w:eastAsia="en-GB"/>
-        </w:rPr>
-      </w:pPr>
-      <w:r>
-        <w:rPr>
-          <w:rFonts w:ascii="Times New Roman" w:eastAsia="Times New Roman" w:hAnsi="Times New Roman" w:cs="Times New Roman"/>
-          <w:bCs/>
-          <w:sz w:val="24"/>
-          <w:szCs w:val="24"/>
-          <w:lang w:eastAsia="en-GB"/>
-        </w:rPr>
-        <w:lastRenderedPageBreak/>
-        <w:t>4. Renunțarea utilizatorului (Final nesatisfăcător cu curățare):</w:t>
+        <w:t>. Renunțarea utilizatorului (Final nesatisfăcător cu curățare):</w:t>
       </w:r>
       <w:r>
         <w:rPr>

</xml_diff>

<commit_message>
dashboard si integritate referentiala
</commit_message>
<xml_diff>
--- a/SolomonLorena_ProgresDemo2.docx
+++ b/SolomonLorena_ProgresDemo2.docx
@@ -15847,6 +15847,14 @@
         </w:rPr>
         <w:t xml:space="preserve">  Si try-catch import create </w:t>
       </w:r>
+      <w:r>
+        <w:rPr>
+          <w:rFonts w:ascii="Times New Roman" w:hAnsi="Times New Roman" w:cs="Times New Roman"/>
+          <w:sz w:val="28"/>
+          <w:szCs w:val="28"/>
+        </w:rPr>
+        <w:t xml:space="preserve">---  </w:t>
+      </w:r>
     </w:p>
     <w:p>
       <w:pPr>
@@ -16347,6 +16355,24 @@
           <w:szCs w:val="28"/>
         </w:rPr>
       </w:pPr>
+    </w:p>
+    <w:p>
+      <w:pPr>
+        <w:rPr>
+          <w:rFonts w:ascii="Times New Roman" w:hAnsi="Times New Roman" w:cs="Times New Roman"/>
+          <w:sz w:val="28"/>
+          <w:szCs w:val="28"/>
+        </w:rPr>
+      </w:pPr>
+    </w:p>
+    <w:p>
+      <w:pPr>
+        <w:rPr>
+          <w:rFonts w:ascii="Times New Roman" w:hAnsi="Times New Roman" w:cs="Times New Roman"/>
+          <w:sz w:val="28"/>
+          <w:szCs w:val="28"/>
+        </w:rPr>
+      </w:pPr>
       <w:r>
         <w:rPr>
           <w:rFonts w:ascii="Times New Roman" w:hAnsi="Times New Roman" w:cs="Times New Roman"/>
@@ -16379,7 +16405,50 @@
           <w:sz w:val="28"/>
           <w:szCs w:val="28"/>
         </w:rPr>
-        <w:t>oprit Hot reload on save; oprit refresh; oprit Enable Browser Link; switched to Edge</w:t>
+        <w:t xml:space="preserve">oprit Hot reload on save; oprit refresh; oprit Enable Browser Link; switched to </w:t>
+      </w:r>
+      <w:proofErr w:type="gramStart"/>
+      <w:r>
+        <w:rPr>
+          <w:rFonts w:ascii="Times New Roman" w:hAnsi="Times New Roman" w:cs="Times New Roman"/>
+          <w:sz w:val="28"/>
+          <w:szCs w:val="28"/>
+        </w:rPr>
+        <w:t>Edge</w:t>
+      </w:r>
+      <w:r>
+        <w:rPr>
+          <w:rFonts w:ascii="Times New Roman" w:hAnsi="Times New Roman" w:cs="Times New Roman"/>
+          <w:sz w:val="28"/>
+          <w:szCs w:val="28"/>
+        </w:rPr>
+        <w:t xml:space="preserve">  --</w:t>
+      </w:r>
+      <w:proofErr w:type="gramEnd"/>
+      <w:r>
+        <w:rPr>
+          <w:rFonts w:ascii="Times New Roman" w:hAnsi="Times New Roman" w:cs="Times New Roman"/>
+          <w:sz w:val="28"/>
+          <w:szCs w:val="28"/>
+        </w:rPr>
+        <w:t xml:space="preserve"> </w:t>
+      </w:r>
+      <w:r>
+        <w:rPr>
+          <w:rFonts w:ascii="Times New Roman" w:hAnsi="Times New Roman" w:cs="Times New Roman"/>
+          <w:sz w:val="28"/>
+          <w:szCs w:val="28"/>
+          <w:highlight w:val="yellow"/>
+        </w:rPr>
+        <w:t>FIXED</w:t>
+      </w:r>
+      <w:r>
+        <w:rPr>
+          <w:rFonts w:ascii="Times New Roman" w:hAnsi="Times New Roman" w:cs="Times New Roman"/>
+          <w:sz w:val="28"/>
+          <w:szCs w:val="28"/>
+        </w:rPr>
+        <w:t xml:space="preserve"> moved to Edge, restarted hot reload &amp; browserlink</w:t>
       </w:r>
       <w:r>
         <w:rPr>
@@ -16510,8 +16579,10 @@
       <w:r>
         <w:rPr>
           <w:rFonts w:ascii="Times New Roman" w:hAnsi="Times New Roman" w:cs="Times New Roman"/>
-          <w:sz w:val="28"/>
-          <w:szCs w:val="28"/>
+          <w:noProof/>
+          <w:sz w:val="28"/>
+          <w:szCs w:val="28"/>
+          <w:lang w:eastAsia="en-GB"/>
         </w:rPr>
         <w:lastRenderedPageBreak/>
         <w:drawing>
@@ -16553,8 +16624,10 @@
       <w:r>
         <w:rPr>
           <w:rFonts w:ascii="Times New Roman" w:hAnsi="Times New Roman" w:cs="Times New Roman"/>
-          <w:sz w:val="28"/>
-          <w:szCs w:val="28"/>
+          <w:noProof/>
+          <w:sz w:val="28"/>
+          <w:szCs w:val="28"/>
+          <w:lang w:eastAsia="en-GB"/>
         </w:rPr>
         <w:drawing>
           <wp:inline distT="0" distB="0" distL="0" distR="0" wp14:anchorId="0A414339" wp14:editId="146E16EE">
@@ -16616,41 +16689,25 @@
           <w:sz w:val="28"/>
           <w:szCs w:val="28"/>
         </w:rPr>
-        <w:t xml:space="preserve"> Pus </w:t>
-      </w:r>
+        <w:t xml:space="preserve"> Pus [</w:t>
+      </w:r>
+      <w:proofErr w:type="gramStart"/>
       <w:r>
         <w:rPr>
           <w:rFonts w:ascii="Times New Roman" w:hAnsi="Times New Roman" w:cs="Times New Roman"/>
           <w:sz w:val="28"/>
           <w:szCs w:val="28"/>
         </w:rPr>
-        <w:t>[</w:t>
-      </w:r>
-      <w:proofErr w:type="gramStart"/>
+        <w:t>Default(</w:t>
+      </w:r>
+      <w:proofErr w:type="gramEnd"/>
       <w:r>
         <w:rPr>
           <w:rFonts w:ascii="Times New Roman" w:hAnsi="Times New Roman" w:cs="Times New Roman"/>
           <w:sz w:val="28"/>
           <w:szCs w:val="28"/>
         </w:rPr>
-        <w:t>Default(</w:t>
-      </w:r>
-      <w:proofErr w:type="gramEnd"/>
-      <w:r>
-        <w:rPr>
-          <w:rFonts w:ascii="Times New Roman" w:hAnsi="Times New Roman" w:cs="Times New Roman"/>
-          <w:sz w:val="28"/>
-          <w:szCs w:val="28"/>
-        </w:rPr>
-        <w:t>0)]</w:t>
-      </w:r>
-      <w:r>
-        <w:rPr>
-          <w:rFonts w:ascii="Times New Roman" w:hAnsi="Times New Roman" w:cs="Times New Roman"/>
-          <w:sz w:val="28"/>
-          <w:szCs w:val="28"/>
-        </w:rPr>
-        <w:t xml:space="preserve"> in model =&gt; PE VIITOR TREBUIE MAPPING / VERIFICARE MAI ATENTA DATE </w:t>
+        <w:t xml:space="preserve">0)] in model =&gt; PE VIITOR TREBUIE MAPPING / VERIFICARE MAI ATENTA DATE </w:t>
       </w:r>
       <w:r>
         <w:rPr>
@@ -16712,8 +16769,121 @@
         </w:rPr>
         <w:t xml:space="preserve"> </w:t>
       </w:r>
+    </w:p>
+    <w:p>
+      <w:pPr>
+        <w:rPr>
+          <w:rFonts w:ascii="Times New Roman" w:hAnsi="Times New Roman" w:cs="Times New Roman"/>
+          <w:sz w:val="28"/>
+          <w:szCs w:val="28"/>
+        </w:rPr>
+      </w:pPr>
+      <w:r>
+        <w:rPr>
+          <w:rFonts w:ascii="Times New Roman" w:hAnsi="Times New Roman" w:cs="Times New Roman"/>
+          <w:sz w:val="28"/>
+          <w:szCs w:val="28"/>
+          <w:highlight w:val="yellow"/>
+        </w:rPr>
+        <w:t>TEMPORAR</w:t>
+      </w:r>
+      <w:r>
+        <w:rPr>
+          <w:rFonts w:ascii="Times New Roman" w:hAnsi="Times New Roman" w:cs="Times New Roman"/>
+          <w:sz w:val="28"/>
+          <w:szCs w:val="28"/>
+        </w:rPr>
+        <w:t xml:space="preserve"> Dashboard razor page in Pages, in loc de folder</w:t>
+      </w:r>
+    </w:p>
+    <w:p>
+      <w:pPr>
+        <w:rPr>
+          <w:rFonts w:ascii="Times New Roman" w:hAnsi="Times New Roman" w:cs="Times New Roman"/>
+          <w:sz w:val="28"/>
+          <w:szCs w:val="28"/>
+        </w:rPr>
+      </w:pPr>
+    </w:p>
+    <w:p>
+      <w:pPr>
+        <w:rPr>
+          <w:rFonts w:ascii="Times New Roman" w:hAnsi="Times New Roman" w:cs="Times New Roman"/>
+          <w:sz w:val="28"/>
+          <w:szCs w:val="28"/>
+        </w:rPr>
+      </w:pPr>
+      <w:r>
+        <w:rPr>
+          <w:rFonts w:ascii="Times New Roman" w:hAnsi="Times New Roman" w:cs="Times New Roman"/>
+          <w:sz w:val="28"/>
+          <w:szCs w:val="28"/>
+        </w:rPr>
+        <w:t xml:space="preserve">JSON.SERIALIZE </w:t>
+      </w:r>
       <w:bookmarkStart w:id="0" w:name="_GoBack"/>
       <w:bookmarkEnd w:id="0"/>
+    </w:p>
+    <w:p>
+      <w:pPr>
+        <w:rPr>
+          <w:rFonts w:ascii="Times New Roman" w:hAnsi="Times New Roman" w:cs="Times New Roman"/>
+          <w:sz w:val="28"/>
+          <w:szCs w:val="28"/>
+        </w:rPr>
+      </w:pPr>
+      <w:r>
+        <w:rPr>
+          <w:rFonts w:ascii="Times New Roman" w:hAnsi="Times New Roman" w:cs="Times New Roman"/>
+          <w:sz w:val="28"/>
+          <w:szCs w:val="28"/>
+        </w:rPr>
+        <w:lastRenderedPageBreak/>
+        <w:drawing>
+          <wp:inline distT="0" distB="0" distL="0" distR="0" wp14:anchorId="2FECD5F9" wp14:editId="19F42BA0">
+            <wp:extent cx="5731510" cy="3085585"/>
+            <wp:effectExtent l="0" t="0" r="2540" b="635"/>
+            <wp:docPr id="12" name="Picture 12"/>
+            <wp:cNvGraphicFramePr>
+              <a:graphicFrameLocks xmlns:a="http://schemas.openxmlformats.org/drawingml/2006/main" noChangeAspect="1"/>
+            </wp:cNvGraphicFramePr>
+            <a:graphic xmlns:a="http://schemas.openxmlformats.org/drawingml/2006/main">
+              <a:graphicData uri="http://schemas.openxmlformats.org/drawingml/2006/picture">
+                <pic:pic xmlns:pic="http://schemas.openxmlformats.org/drawingml/2006/picture">
+                  <pic:nvPicPr>
+                    <pic:cNvPr id="0" name=""/>
+                    <pic:cNvPicPr/>
+                  </pic:nvPicPr>
+                  <pic:blipFill>
+                    <a:blip r:embed="rId36"/>
+                    <a:stretch>
+                      <a:fillRect/>
+                    </a:stretch>
+                  </pic:blipFill>
+                  <pic:spPr>
+                    <a:xfrm>
+                      <a:off x="0" y="0"/>
+                      <a:ext cx="5731510" cy="3085585"/>
+                    </a:xfrm>
+                    <a:prstGeom prst="rect">
+                      <a:avLst/>
+                    </a:prstGeom>
+                  </pic:spPr>
+                </pic:pic>
+              </a:graphicData>
+            </a:graphic>
+          </wp:inline>
+        </w:drawing>
+      </w:r>
+    </w:p>
+    <w:p>
+      <w:pPr>
+        <w:rPr>
+          <w:rFonts w:ascii="Times New Roman" w:hAnsi="Times New Roman" w:cs="Times New Roman"/>
+          <w:sz w:val="28"/>
+          <w:szCs w:val="28"/>
+        </w:rPr>
+      </w:pPr>
     </w:p>
     <w:sectPr>
       <w:pgSz w:w="11906" w:h="16838"/>

</xml_diff>

<commit_message>
fixed demo. updated modele, reparat integritate, dashboard
</commit_message>
<xml_diff>
--- a/SolomonLorena_ProgresDemo2.docx
+++ b/SolomonLorena_ProgresDemo2.docx
@@ -16821,22 +16821,22 @@
         </w:rPr>
         <w:t xml:space="preserve">JSON.SERIALIZE </w:t>
       </w:r>
-      <w:bookmarkStart w:id="0" w:name="_GoBack"/>
-      <w:bookmarkEnd w:id="0"/>
-    </w:p>
-    <w:p>
-      <w:pPr>
-        <w:rPr>
-          <w:rFonts w:ascii="Times New Roman" w:hAnsi="Times New Roman" w:cs="Times New Roman"/>
-          <w:sz w:val="28"/>
-          <w:szCs w:val="28"/>
-        </w:rPr>
-      </w:pPr>
-      <w:r>
-        <w:rPr>
-          <w:rFonts w:ascii="Times New Roman" w:hAnsi="Times New Roman" w:cs="Times New Roman"/>
-          <w:sz w:val="28"/>
-          <w:szCs w:val="28"/>
+    </w:p>
+    <w:p>
+      <w:pPr>
+        <w:rPr>
+          <w:rFonts w:ascii="Times New Roman" w:hAnsi="Times New Roman" w:cs="Times New Roman"/>
+          <w:sz w:val="28"/>
+          <w:szCs w:val="28"/>
+        </w:rPr>
+      </w:pPr>
+      <w:r>
+        <w:rPr>
+          <w:rFonts w:ascii="Times New Roman" w:hAnsi="Times New Roman" w:cs="Times New Roman"/>
+          <w:noProof/>
+          <w:sz w:val="28"/>
+          <w:szCs w:val="28"/>
+          <w:lang w:eastAsia="en-GB"/>
         </w:rPr>
         <w:lastRenderedPageBreak/>
         <w:drawing>
@@ -16884,6 +16884,1655 @@
           <w:szCs w:val="28"/>
         </w:rPr>
       </w:pPr>
+      <w:r>
+        <w:rPr>
+          <w:rFonts w:ascii="Times New Roman" w:hAnsi="Times New Roman" w:cs="Times New Roman"/>
+          <w:noProof/>
+          <w:sz w:val="28"/>
+          <w:szCs w:val="28"/>
+          <w:lang w:eastAsia="en-GB"/>
+        </w:rPr>
+        <w:drawing>
+          <wp:inline distT="0" distB="0" distL="0" distR="0" wp14:anchorId="4ABDB3EE" wp14:editId="7B543904">
+            <wp:extent cx="5731510" cy="4046348"/>
+            <wp:effectExtent l="0" t="0" r="2540" b="0"/>
+            <wp:docPr id="13" name="Picture 13"/>
+            <wp:cNvGraphicFramePr>
+              <a:graphicFrameLocks xmlns:a="http://schemas.openxmlformats.org/drawingml/2006/main" noChangeAspect="1"/>
+            </wp:cNvGraphicFramePr>
+            <a:graphic xmlns:a="http://schemas.openxmlformats.org/drawingml/2006/main">
+              <a:graphicData uri="http://schemas.openxmlformats.org/drawingml/2006/picture">
+                <pic:pic xmlns:pic="http://schemas.openxmlformats.org/drawingml/2006/picture">
+                  <pic:nvPicPr>
+                    <pic:cNvPr id="0" name=""/>
+                    <pic:cNvPicPr/>
+                  </pic:nvPicPr>
+                  <pic:blipFill>
+                    <a:blip r:embed="rId37"/>
+                    <a:stretch>
+                      <a:fillRect/>
+                    </a:stretch>
+                  </pic:blipFill>
+                  <pic:spPr>
+                    <a:xfrm>
+                      <a:off x="0" y="0"/>
+                      <a:ext cx="5731510" cy="4046348"/>
+                    </a:xfrm>
+                    <a:prstGeom prst="rect">
+                      <a:avLst/>
+                    </a:prstGeom>
+                  </pic:spPr>
+                </pic:pic>
+              </a:graphicData>
+            </a:graphic>
+          </wp:inline>
+        </w:drawing>
+      </w:r>
+    </w:p>
+    <w:p>
+      <w:pPr>
+        <w:rPr>
+          <w:rFonts w:ascii="Times New Roman" w:hAnsi="Times New Roman" w:cs="Times New Roman"/>
+          <w:sz w:val="28"/>
+          <w:szCs w:val="28"/>
+        </w:rPr>
+      </w:pPr>
+      <w:r>
+        <w:rPr>
+          <w:rFonts w:ascii="Times New Roman" w:hAnsi="Times New Roman" w:cs="Times New Roman"/>
+          <w:sz w:val="28"/>
+          <w:szCs w:val="28"/>
+        </w:rPr>
+        <w:t>Incarcat dublu --- schimbat in UPSERT</w:t>
+      </w:r>
+    </w:p>
+    <w:p>
+      <w:pPr>
+        <w:rPr>
+          <w:rStyle w:val="HTMLCode"/>
+          <w:rFonts w:ascii="Times New Roman" w:eastAsiaTheme="minorHAnsi" w:hAnsi="Times New Roman" w:cs="Times New Roman"/>
+          <w:sz w:val="28"/>
+          <w:szCs w:val="28"/>
+        </w:rPr>
+      </w:pPr>
+      <w:r>
+        <w:rPr>
+          <w:rStyle w:val="HTMLCode"/>
+          <w:rFonts w:ascii="Times New Roman" w:eastAsiaTheme="minorHAnsi" w:hAnsi="Times New Roman" w:cs="Times New Roman"/>
+          <w:bCs/>
+          <w:sz w:val="28"/>
+          <w:szCs w:val="28"/>
+        </w:rPr>
+        <w:t>Imports/Create.cshtml.cs</w:t>
+      </w:r>
+      <w:r>
+        <w:rPr>
+          <w:rFonts w:ascii="Times New Roman" w:hAnsi="Times New Roman" w:cs="Times New Roman"/>
+          <w:sz w:val="28"/>
+          <w:szCs w:val="28"/>
+        </w:rPr>
+        <w:t xml:space="preserve"> </w:t>
+      </w:r>
+      <w:r>
+        <w:rPr>
+          <w:rStyle w:val="HTMLCode"/>
+          <w:rFonts w:ascii="Times New Roman" w:eastAsiaTheme="minorHAnsi" w:hAnsi="Times New Roman" w:cs="Times New Roman"/>
+          <w:sz w:val="28"/>
+          <w:szCs w:val="28"/>
+        </w:rPr>
+        <w:t>OnPostAsync</w:t>
+      </w:r>
+    </w:p>
+    <w:p>
+      <w:pPr>
+        <w:autoSpaceDE w:val="0"/>
+        <w:autoSpaceDN w:val="0"/>
+        <w:adjustRightInd w:val="0"/>
+        <w:spacing w:after="0" w:line="240" w:lineRule="auto"/>
+        <w:rPr>
+          <w:rFonts w:ascii="Cascadia Mono" w:hAnsi="Cascadia Mono" w:cs="Cascadia Mono"/>
+          <w:color w:val="008000"/>
+          <w:sz w:val="19"/>
+          <w:szCs w:val="19"/>
+          <w:highlight w:val="white"/>
+        </w:rPr>
+      </w:pPr>
+      <w:r>
+        <w:rPr>
+          <w:rFonts w:ascii="Cascadia Mono" w:hAnsi="Cascadia Mono" w:cs="Cascadia Mono"/>
+          <w:color w:val="008000"/>
+          <w:sz w:val="19"/>
+          <w:szCs w:val="19"/>
+          <w:highlight w:val="white"/>
+        </w:rPr>
+        <w:t xml:space="preserve">// UPSERT </w:t>
+      </w:r>
+    </w:p>
+    <w:p>
+      <w:pPr>
+        <w:autoSpaceDE w:val="0"/>
+        <w:autoSpaceDN w:val="0"/>
+        <w:adjustRightInd w:val="0"/>
+        <w:spacing w:after="0" w:line="240" w:lineRule="auto"/>
+        <w:rPr>
+          <w:rFonts w:ascii="Cascadia Mono" w:hAnsi="Cascadia Mono" w:cs="Cascadia Mono"/>
+          <w:color w:val="000000"/>
+          <w:sz w:val="19"/>
+          <w:szCs w:val="19"/>
+          <w:highlight w:val="white"/>
+        </w:rPr>
+      </w:pPr>
+      <w:proofErr w:type="gramStart"/>
+      <w:r>
+        <w:rPr>
+          <w:rFonts w:ascii="Cascadia Mono" w:hAnsi="Cascadia Mono" w:cs="Cascadia Mono"/>
+          <w:color w:val="0000FF"/>
+          <w:sz w:val="19"/>
+          <w:szCs w:val="19"/>
+          <w:highlight w:val="white"/>
+        </w:rPr>
+        <w:t>var</w:t>
+      </w:r>
+      <w:proofErr w:type="gramEnd"/>
+      <w:r>
+        <w:rPr>
+          <w:rFonts w:ascii="Cascadia Mono" w:hAnsi="Cascadia Mono" w:cs="Cascadia Mono"/>
+          <w:color w:val="000000"/>
+          <w:sz w:val="19"/>
+          <w:szCs w:val="19"/>
+          <w:highlight w:val="white"/>
+        </w:rPr>
+        <w:t xml:space="preserve"> OldReport = _context.YearlyFinancialReport</w:t>
+      </w:r>
+    </w:p>
+    <w:p>
+      <w:pPr>
+        <w:autoSpaceDE w:val="0"/>
+        <w:autoSpaceDN w:val="0"/>
+        <w:adjustRightInd w:val="0"/>
+        <w:spacing w:after="0" w:line="240" w:lineRule="auto"/>
+        <w:rPr>
+          <w:rFonts w:ascii="Cascadia Mono" w:hAnsi="Cascadia Mono" w:cs="Cascadia Mono"/>
+          <w:color w:val="000000"/>
+          <w:sz w:val="19"/>
+          <w:szCs w:val="19"/>
+          <w:highlight w:val="white"/>
+        </w:rPr>
+      </w:pPr>
+      <w:r>
+        <w:rPr>
+          <w:rFonts w:ascii="Cascadia Mono" w:hAnsi="Cascadia Mono" w:cs="Cascadia Mono"/>
+          <w:color w:val="000000"/>
+          <w:sz w:val="19"/>
+          <w:szCs w:val="19"/>
+          <w:highlight w:val="white"/>
+        </w:rPr>
+        <w:t xml:space="preserve">    .Include(r =&gt; r.Import)</w:t>
+      </w:r>
+    </w:p>
+    <w:p>
+      <w:pPr>
+        <w:autoSpaceDE w:val="0"/>
+        <w:autoSpaceDN w:val="0"/>
+        <w:adjustRightInd w:val="0"/>
+        <w:spacing w:after="0" w:line="240" w:lineRule="auto"/>
+        <w:rPr>
+          <w:rFonts w:ascii="Cascadia Mono" w:hAnsi="Cascadia Mono" w:cs="Cascadia Mono"/>
+          <w:color w:val="000000"/>
+          <w:sz w:val="19"/>
+          <w:szCs w:val="19"/>
+          <w:highlight w:val="white"/>
+        </w:rPr>
+      </w:pPr>
+      <w:r>
+        <w:rPr>
+          <w:rFonts w:ascii="Cascadia Mono" w:hAnsi="Cascadia Mono" w:cs="Cascadia Mono"/>
+          <w:color w:val="000000"/>
+          <w:sz w:val="19"/>
+          <w:szCs w:val="19"/>
+          <w:highlight w:val="white"/>
+        </w:rPr>
+        <w:t xml:space="preserve">    .Where(r =&gt; r.Import.CompanyId == Import.CompanyId)</w:t>
+      </w:r>
+    </w:p>
+    <w:p>
+      <w:pPr>
+        <w:autoSpaceDE w:val="0"/>
+        <w:autoSpaceDN w:val="0"/>
+        <w:adjustRightInd w:val="0"/>
+        <w:spacing w:after="0" w:line="240" w:lineRule="auto"/>
+        <w:rPr>
+          <w:rFonts w:ascii="Cascadia Mono" w:hAnsi="Cascadia Mono" w:cs="Cascadia Mono"/>
+          <w:color w:val="000000"/>
+          <w:sz w:val="19"/>
+          <w:szCs w:val="19"/>
+          <w:highlight w:val="white"/>
+        </w:rPr>
+      </w:pPr>
+      <w:r>
+        <w:rPr>
+          <w:rFonts w:ascii="Cascadia Mono" w:hAnsi="Cascadia Mono" w:cs="Cascadia Mono"/>
+          <w:color w:val="000000"/>
+          <w:sz w:val="19"/>
+          <w:szCs w:val="19"/>
+          <w:highlight w:val="white"/>
+        </w:rPr>
+        <w:lastRenderedPageBreak/>
+        <w:t xml:space="preserve">    .</w:t>
+      </w:r>
+      <w:proofErr w:type="gramStart"/>
+      <w:r>
+        <w:rPr>
+          <w:rFonts w:ascii="Cascadia Mono" w:hAnsi="Cascadia Mono" w:cs="Cascadia Mono"/>
+          <w:color w:val="000000"/>
+          <w:sz w:val="19"/>
+          <w:szCs w:val="19"/>
+          <w:highlight w:val="white"/>
+        </w:rPr>
+        <w:t>ToList(</w:t>
+      </w:r>
+      <w:proofErr w:type="gramEnd"/>
+      <w:r>
+        <w:rPr>
+          <w:rFonts w:ascii="Cascadia Mono" w:hAnsi="Cascadia Mono" w:cs="Cascadia Mono"/>
+          <w:color w:val="000000"/>
+          <w:sz w:val="19"/>
+          <w:szCs w:val="19"/>
+          <w:highlight w:val="white"/>
+        </w:rPr>
+        <w:t>);</w:t>
+      </w:r>
+    </w:p>
+    <w:p>
+      <w:pPr>
+        <w:autoSpaceDE w:val="0"/>
+        <w:autoSpaceDN w:val="0"/>
+        <w:adjustRightInd w:val="0"/>
+        <w:spacing w:after="0" w:line="240" w:lineRule="auto"/>
+        <w:rPr>
+          <w:rFonts w:ascii="Cascadia Mono" w:hAnsi="Cascadia Mono" w:cs="Cascadia Mono"/>
+          <w:color w:val="000000"/>
+          <w:sz w:val="19"/>
+          <w:szCs w:val="19"/>
+          <w:highlight w:val="white"/>
+        </w:rPr>
+      </w:pPr>
+    </w:p>
+    <w:p>
+      <w:pPr>
+        <w:autoSpaceDE w:val="0"/>
+        <w:autoSpaceDN w:val="0"/>
+        <w:adjustRightInd w:val="0"/>
+        <w:spacing w:after="0" w:line="240" w:lineRule="auto"/>
+        <w:rPr>
+          <w:rFonts w:ascii="Cascadia Mono" w:hAnsi="Cascadia Mono" w:cs="Cascadia Mono"/>
+          <w:color w:val="000000"/>
+          <w:sz w:val="19"/>
+          <w:szCs w:val="19"/>
+          <w:highlight w:val="white"/>
+        </w:rPr>
+      </w:pPr>
+      <w:proofErr w:type="gramStart"/>
+      <w:r>
+        <w:rPr>
+          <w:rFonts w:ascii="Cascadia Mono" w:hAnsi="Cascadia Mono" w:cs="Cascadia Mono"/>
+          <w:color w:val="0000FF"/>
+          <w:sz w:val="19"/>
+          <w:szCs w:val="19"/>
+          <w:highlight w:val="white"/>
+        </w:rPr>
+        <w:t>if</w:t>
+      </w:r>
+      <w:proofErr w:type="gramEnd"/>
+      <w:r>
+        <w:rPr>
+          <w:rFonts w:ascii="Cascadia Mono" w:hAnsi="Cascadia Mono" w:cs="Cascadia Mono"/>
+          <w:color w:val="000000"/>
+          <w:sz w:val="19"/>
+          <w:szCs w:val="19"/>
+          <w:highlight w:val="white"/>
+        </w:rPr>
+        <w:t xml:space="preserve"> (OldReport.Any())</w:t>
+      </w:r>
+    </w:p>
+    <w:p>
+      <w:pPr>
+        <w:autoSpaceDE w:val="0"/>
+        <w:autoSpaceDN w:val="0"/>
+        <w:adjustRightInd w:val="0"/>
+        <w:spacing w:after="0" w:line="240" w:lineRule="auto"/>
+        <w:rPr>
+          <w:rFonts w:ascii="Cascadia Mono" w:hAnsi="Cascadia Mono" w:cs="Cascadia Mono"/>
+          <w:color w:val="000000"/>
+          <w:sz w:val="19"/>
+          <w:szCs w:val="19"/>
+          <w:highlight w:val="white"/>
+        </w:rPr>
+      </w:pPr>
+      <w:r>
+        <w:rPr>
+          <w:rFonts w:ascii="Cascadia Mono" w:hAnsi="Cascadia Mono" w:cs="Cascadia Mono"/>
+          <w:color w:val="000000"/>
+          <w:sz w:val="19"/>
+          <w:szCs w:val="19"/>
+          <w:highlight w:val="white"/>
+        </w:rPr>
+        <w:t>{</w:t>
+      </w:r>
+    </w:p>
+    <w:p>
+      <w:pPr>
+        <w:autoSpaceDE w:val="0"/>
+        <w:autoSpaceDN w:val="0"/>
+        <w:adjustRightInd w:val="0"/>
+        <w:spacing w:after="0" w:line="240" w:lineRule="auto"/>
+        <w:rPr>
+          <w:rFonts w:ascii="Cascadia Mono" w:hAnsi="Cascadia Mono" w:cs="Cascadia Mono"/>
+          <w:color w:val="000000"/>
+          <w:sz w:val="19"/>
+          <w:szCs w:val="19"/>
+          <w:highlight w:val="white"/>
+        </w:rPr>
+      </w:pPr>
+      <w:r>
+        <w:rPr>
+          <w:rFonts w:ascii="Cascadia Mono" w:hAnsi="Cascadia Mono" w:cs="Cascadia Mono"/>
+          <w:color w:val="000000"/>
+          <w:sz w:val="19"/>
+          <w:szCs w:val="19"/>
+          <w:highlight w:val="white"/>
+        </w:rPr>
+        <w:t xml:space="preserve">    _</w:t>
+      </w:r>
+      <w:proofErr w:type="gramStart"/>
+      <w:r>
+        <w:rPr>
+          <w:rFonts w:ascii="Cascadia Mono" w:hAnsi="Cascadia Mono" w:cs="Cascadia Mono"/>
+          <w:color w:val="000000"/>
+          <w:sz w:val="19"/>
+          <w:szCs w:val="19"/>
+          <w:highlight w:val="white"/>
+        </w:rPr>
+        <w:t>context.YearlyFinancialReport.RemoveRange(</w:t>
+      </w:r>
+      <w:proofErr w:type="gramEnd"/>
+      <w:r>
+        <w:rPr>
+          <w:rFonts w:ascii="Cascadia Mono" w:hAnsi="Cascadia Mono" w:cs="Cascadia Mono"/>
+          <w:color w:val="000000"/>
+          <w:sz w:val="19"/>
+          <w:szCs w:val="19"/>
+          <w:highlight w:val="white"/>
+        </w:rPr>
+        <w:t>OldReport);</w:t>
+      </w:r>
+    </w:p>
+    <w:p>
+      <w:pPr>
+        <w:autoSpaceDE w:val="0"/>
+        <w:autoSpaceDN w:val="0"/>
+        <w:adjustRightInd w:val="0"/>
+        <w:spacing w:after="0" w:line="240" w:lineRule="auto"/>
+        <w:rPr>
+          <w:rFonts w:ascii="Cascadia Mono" w:hAnsi="Cascadia Mono" w:cs="Cascadia Mono"/>
+          <w:color w:val="000000"/>
+          <w:sz w:val="19"/>
+          <w:szCs w:val="19"/>
+          <w:highlight w:val="white"/>
+        </w:rPr>
+      </w:pPr>
+      <w:r>
+        <w:rPr>
+          <w:rFonts w:ascii="Cascadia Mono" w:hAnsi="Cascadia Mono" w:cs="Cascadia Mono"/>
+          <w:color w:val="000000"/>
+          <w:sz w:val="19"/>
+          <w:szCs w:val="19"/>
+          <w:highlight w:val="white"/>
+        </w:rPr>
+        <w:t>}</w:t>
+      </w:r>
+    </w:p>
+    <w:p>
+      <w:pPr>
+        <w:autoSpaceDE w:val="0"/>
+        <w:autoSpaceDN w:val="0"/>
+        <w:adjustRightInd w:val="0"/>
+        <w:spacing w:after="0" w:line="240" w:lineRule="auto"/>
+        <w:rPr>
+          <w:rFonts w:ascii="Cascadia Mono" w:hAnsi="Cascadia Mono" w:cs="Cascadia Mono"/>
+          <w:color w:val="000000"/>
+          <w:sz w:val="19"/>
+          <w:szCs w:val="19"/>
+          <w:highlight w:val="white"/>
+        </w:rPr>
+      </w:pPr>
+    </w:p>
+    <w:p>
+      <w:pPr>
+        <w:autoSpaceDE w:val="0"/>
+        <w:autoSpaceDN w:val="0"/>
+        <w:adjustRightInd w:val="0"/>
+        <w:spacing w:after="0" w:line="240" w:lineRule="auto"/>
+        <w:rPr>
+          <w:rFonts w:ascii="Cascadia Mono" w:hAnsi="Cascadia Mono" w:cs="Cascadia Mono"/>
+          <w:color w:val="000000"/>
+          <w:sz w:val="19"/>
+          <w:szCs w:val="19"/>
+          <w:highlight w:val="white"/>
+        </w:rPr>
+      </w:pPr>
+      <w:r>
+        <w:rPr>
+          <w:rFonts w:ascii="Cascadia Mono" w:hAnsi="Cascadia Mono" w:cs="Cascadia Mono"/>
+          <w:color w:val="000000"/>
+          <w:sz w:val="19"/>
+          <w:szCs w:val="19"/>
+          <w:highlight w:val="white"/>
+        </w:rPr>
+        <w:t>_</w:t>
+      </w:r>
+      <w:proofErr w:type="gramStart"/>
+      <w:r>
+        <w:rPr>
+          <w:rFonts w:ascii="Cascadia Mono" w:hAnsi="Cascadia Mono" w:cs="Cascadia Mono"/>
+          <w:color w:val="000000"/>
+          <w:sz w:val="19"/>
+          <w:szCs w:val="19"/>
+          <w:highlight w:val="white"/>
+        </w:rPr>
+        <w:t>context.YearlyFinancialReport.AddRange(</w:t>
+      </w:r>
+      <w:proofErr w:type="gramEnd"/>
+      <w:r>
+        <w:rPr>
+          <w:rFonts w:ascii="Cascadia Mono" w:hAnsi="Cascadia Mono" w:cs="Cascadia Mono"/>
+          <w:color w:val="000000"/>
+          <w:sz w:val="19"/>
+          <w:szCs w:val="19"/>
+          <w:highlight w:val="white"/>
+        </w:rPr>
+        <w:t>CalculatedReport);</w:t>
+      </w:r>
+    </w:p>
+    <w:p>
+      <w:pPr>
+        <w:autoSpaceDE w:val="0"/>
+        <w:autoSpaceDN w:val="0"/>
+        <w:adjustRightInd w:val="0"/>
+        <w:spacing w:after="0" w:line="240" w:lineRule="auto"/>
+        <w:rPr>
+          <w:rFonts w:ascii="Cascadia Mono" w:hAnsi="Cascadia Mono" w:cs="Cascadia Mono"/>
+          <w:color w:val="000000"/>
+          <w:sz w:val="19"/>
+          <w:szCs w:val="19"/>
+        </w:rPr>
+      </w:pPr>
+      <w:proofErr w:type="gramStart"/>
+      <w:r>
+        <w:rPr>
+          <w:rFonts w:ascii="Cascadia Mono" w:hAnsi="Cascadia Mono" w:cs="Cascadia Mono"/>
+          <w:color w:val="0000FF"/>
+          <w:sz w:val="19"/>
+          <w:szCs w:val="19"/>
+          <w:highlight w:val="white"/>
+        </w:rPr>
+        <w:t>await</w:t>
+      </w:r>
+      <w:proofErr w:type="gramEnd"/>
+      <w:r>
+        <w:rPr>
+          <w:rFonts w:ascii="Cascadia Mono" w:hAnsi="Cascadia Mono" w:cs="Cascadia Mono"/>
+          <w:color w:val="000000"/>
+          <w:sz w:val="19"/>
+          <w:szCs w:val="19"/>
+          <w:highlight w:val="white"/>
+        </w:rPr>
+        <w:t xml:space="preserve"> _context.SaveChangesAsync();</w:t>
+      </w:r>
+    </w:p>
+    <w:p>
+      <w:pPr>
+        <w:autoSpaceDE w:val="0"/>
+        <w:autoSpaceDN w:val="0"/>
+        <w:adjustRightInd w:val="0"/>
+        <w:spacing w:after="0" w:line="240" w:lineRule="auto"/>
+        <w:rPr>
+          <w:rFonts w:ascii="Cascadia Mono" w:hAnsi="Cascadia Mono" w:cs="Cascadia Mono"/>
+          <w:color w:val="000000"/>
+          <w:sz w:val="19"/>
+          <w:szCs w:val="19"/>
+        </w:rPr>
+      </w:pPr>
+    </w:p>
+    <w:p>
+      <w:pPr>
+        <w:autoSpaceDE w:val="0"/>
+        <w:autoSpaceDN w:val="0"/>
+        <w:adjustRightInd w:val="0"/>
+        <w:spacing w:after="0" w:line="240" w:lineRule="auto"/>
+        <w:rPr>
+          <w:rFonts w:ascii="Cascadia Mono" w:hAnsi="Cascadia Mono" w:cs="Cascadia Mono"/>
+          <w:color w:val="000000"/>
+          <w:sz w:val="19"/>
+          <w:szCs w:val="19"/>
+        </w:rPr>
+      </w:pPr>
+    </w:p>
+    <w:p>
+      <w:pPr>
+        <w:autoSpaceDE w:val="0"/>
+        <w:autoSpaceDN w:val="0"/>
+        <w:adjustRightInd w:val="0"/>
+        <w:spacing w:after="0" w:line="240" w:lineRule="auto"/>
+        <w:rPr>
+          <w:rFonts w:ascii="Cascadia Mono" w:hAnsi="Cascadia Mono" w:cs="Cascadia Mono"/>
+          <w:color w:val="000000"/>
+          <w:sz w:val="19"/>
+          <w:szCs w:val="19"/>
+        </w:rPr>
+      </w:pPr>
+    </w:p>
+    <w:p>
+      <w:pPr>
+        <w:pStyle w:val="Heading1"/>
+      </w:pPr>
+      <w:r>
+        <w:t>Integritate referentiala</w:t>
+      </w:r>
+    </w:p>
+    <w:p>
+      <w:pPr>
+        <w:autoSpaceDE w:val="0"/>
+        <w:autoSpaceDN w:val="0"/>
+        <w:adjustRightInd w:val="0"/>
+        <w:spacing w:after="0" w:line="240" w:lineRule="auto"/>
+        <w:rPr>
+          <w:rFonts w:ascii="Times New Roman" w:hAnsi="Times New Roman" w:cs="Times New Roman"/>
+          <w:sz w:val="28"/>
+          <w:szCs w:val="28"/>
+        </w:rPr>
+      </w:pPr>
+      <w:r>
+        <w:rPr>
+          <w:rFonts w:ascii="Times New Roman" w:hAnsi="Times New Roman" w:cs="Times New Roman"/>
+          <w:noProof/>
+          <w:sz w:val="28"/>
+          <w:szCs w:val="28"/>
+          <w:lang w:eastAsia="en-GB"/>
+        </w:rPr>
+        <w:drawing>
+          <wp:inline distT="0" distB="0" distL="0" distR="0" wp14:anchorId="6C84115D" wp14:editId="2D9EE76D">
+            <wp:extent cx="5731510" cy="3046396"/>
+            <wp:effectExtent l="0" t="0" r="2540" b="1905"/>
+            <wp:docPr id="14" name="Picture 14"/>
+            <wp:cNvGraphicFramePr>
+              <a:graphicFrameLocks xmlns:a="http://schemas.openxmlformats.org/drawingml/2006/main" noChangeAspect="1"/>
+            </wp:cNvGraphicFramePr>
+            <a:graphic xmlns:a="http://schemas.openxmlformats.org/drawingml/2006/main">
+              <a:graphicData uri="http://schemas.openxmlformats.org/drawingml/2006/picture">
+                <pic:pic xmlns:pic="http://schemas.openxmlformats.org/drawingml/2006/picture">
+                  <pic:nvPicPr>
+                    <pic:cNvPr id="0" name=""/>
+                    <pic:cNvPicPr/>
+                  </pic:nvPicPr>
+                  <pic:blipFill>
+                    <a:blip r:embed="rId38"/>
+                    <a:stretch>
+                      <a:fillRect/>
+                    </a:stretch>
+                  </pic:blipFill>
+                  <pic:spPr>
+                    <a:xfrm>
+                      <a:off x="0" y="0"/>
+                      <a:ext cx="5731510" cy="3046396"/>
+                    </a:xfrm>
+                    <a:prstGeom prst="rect">
+                      <a:avLst/>
+                    </a:prstGeom>
+                  </pic:spPr>
+                </pic:pic>
+              </a:graphicData>
+            </a:graphic>
+          </wp:inline>
+        </w:drawing>
+      </w:r>
+    </w:p>
+    <w:p>
+      <w:pPr>
+        <w:autoSpaceDE w:val="0"/>
+        <w:autoSpaceDN w:val="0"/>
+        <w:adjustRightInd w:val="0"/>
+        <w:spacing w:after="0" w:line="240" w:lineRule="auto"/>
+        <w:rPr>
+          <w:rFonts w:ascii="Times New Roman" w:hAnsi="Times New Roman" w:cs="Times New Roman"/>
+          <w:sz w:val="28"/>
+          <w:szCs w:val="28"/>
+        </w:rPr>
+      </w:pPr>
+    </w:p>
+    <w:p>
+      <w:pPr>
+        <w:autoSpaceDE w:val="0"/>
+        <w:autoSpaceDN w:val="0"/>
+        <w:adjustRightInd w:val="0"/>
+        <w:spacing w:after="0" w:line="240" w:lineRule="auto"/>
+        <w:rPr>
+          <w:rFonts w:ascii="Times New Roman" w:hAnsi="Times New Roman" w:cs="Times New Roman"/>
+          <w:sz w:val="28"/>
+          <w:szCs w:val="28"/>
+        </w:rPr>
+      </w:pPr>
+      <w:r>
+        <w:rPr>
+          <w:rFonts w:ascii="Times New Roman" w:hAnsi="Times New Roman" w:cs="Times New Roman"/>
+          <w:sz w:val="28"/>
+          <w:szCs w:val="28"/>
+        </w:rPr>
+        <w:t>Import/Detele.cshtml.cs inclus rapoarteCopii cautate si sterse</w:t>
+      </w:r>
+    </w:p>
+    <w:p>
+      <w:pPr>
+        <w:autoSpaceDE w:val="0"/>
+        <w:autoSpaceDN w:val="0"/>
+        <w:adjustRightInd w:val="0"/>
+        <w:spacing w:after="0" w:line="240" w:lineRule="auto"/>
+        <w:rPr>
+          <w:rFonts w:ascii="Times New Roman" w:hAnsi="Times New Roman" w:cs="Times New Roman"/>
+          <w:sz w:val="28"/>
+          <w:szCs w:val="28"/>
+        </w:rPr>
+      </w:pPr>
+      <w:r>
+        <w:rPr>
+          <w:rFonts w:ascii="Times New Roman" w:hAnsi="Times New Roman" w:cs="Times New Roman"/>
+          <w:sz w:val="28"/>
+          <w:szCs w:val="28"/>
+        </w:rPr>
+        <w:t>Similar Company</w:t>
+      </w:r>
+    </w:p>
+    <w:p>
+      <w:pPr>
+        <w:autoSpaceDE w:val="0"/>
+        <w:autoSpaceDN w:val="0"/>
+        <w:adjustRightInd w:val="0"/>
+        <w:spacing w:after="0" w:line="240" w:lineRule="auto"/>
+        <w:rPr>
+          <w:rFonts w:ascii="Times New Roman" w:hAnsi="Times New Roman" w:cs="Times New Roman"/>
+          <w:sz w:val="28"/>
+          <w:szCs w:val="28"/>
+        </w:rPr>
+      </w:pPr>
+    </w:p>
+    <w:p>
+      <w:pPr>
+        <w:autoSpaceDE w:val="0"/>
+        <w:autoSpaceDN w:val="0"/>
+        <w:adjustRightInd w:val="0"/>
+        <w:spacing w:after="0" w:line="240" w:lineRule="auto"/>
+        <w:rPr>
+          <w:rFonts w:ascii="Times New Roman" w:hAnsi="Times New Roman" w:cs="Times New Roman"/>
+          <w:sz w:val="28"/>
+          <w:szCs w:val="28"/>
+        </w:rPr>
+      </w:pPr>
+      <w:r>
+        <w:rPr>
+          <w:rFonts w:ascii="Times New Roman" w:hAnsi="Times New Roman" w:cs="Times New Roman"/>
+          <w:sz w:val="28"/>
+          <w:szCs w:val="28"/>
+        </w:rPr>
+        <w:t>Integritate Edit import – nu se poate schiiba fisierul</w:t>
+      </w:r>
+      <w:r>
+        <w:rPr>
+          <w:rFonts w:ascii="Times New Roman" w:hAnsi="Times New Roman" w:cs="Times New Roman"/>
+          <w:sz w:val="28"/>
+          <w:szCs w:val="28"/>
+        </w:rPr>
+        <w:t>, data import, nume</w:t>
+      </w:r>
+    </w:p>
+    <w:p>
+      <w:pPr>
+        <w:autoSpaceDE w:val="0"/>
+        <w:autoSpaceDN w:val="0"/>
+        <w:adjustRightInd w:val="0"/>
+        <w:spacing w:after="0" w:line="240" w:lineRule="auto"/>
+        <w:rPr>
+          <w:rFonts w:ascii="Times New Roman" w:hAnsi="Times New Roman" w:cs="Times New Roman"/>
+          <w:sz w:val="28"/>
+          <w:szCs w:val="28"/>
+        </w:rPr>
+      </w:pPr>
+      <w:r>
+        <w:rPr>
+          <w:rFonts w:ascii="Times New Roman" w:hAnsi="Times New Roman" w:cs="Times New Roman"/>
+          <w:sz w:val="28"/>
+          <w:szCs w:val="28"/>
+        </w:rPr>
+        <w:tab/>
+        <w:t>Nou migration, schimbat in model nav props, totul obligatoriu</w:t>
+      </w:r>
+    </w:p>
+    <w:p>
+      <w:pPr>
+        <w:autoSpaceDE w:val="0"/>
+        <w:autoSpaceDN w:val="0"/>
+        <w:adjustRightInd w:val="0"/>
+        <w:spacing w:after="0" w:line="240" w:lineRule="auto"/>
+        <w:rPr>
+          <w:rFonts w:ascii="Times New Roman" w:hAnsi="Times New Roman" w:cs="Times New Roman"/>
+          <w:sz w:val="28"/>
+          <w:szCs w:val="28"/>
+        </w:rPr>
+      </w:pPr>
+      <w:r>
+        <w:rPr>
+          <w:rFonts w:ascii="Times New Roman" w:hAnsi="Times New Roman" w:cs="Times New Roman"/>
+          <w:sz w:val="28"/>
+          <w:szCs w:val="28"/>
+        </w:rPr>
+        <w:t>Compnay 1-M Import 1-M YFR obligatoriu toate</w:t>
+      </w:r>
+    </w:p>
+    <w:p>
+      <w:pPr>
+        <w:autoSpaceDE w:val="0"/>
+        <w:autoSpaceDN w:val="0"/>
+        <w:adjustRightInd w:val="0"/>
+        <w:spacing w:after="0" w:line="240" w:lineRule="auto"/>
+        <w:rPr>
+          <w:rFonts w:ascii="Times New Roman" w:hAnsi="Times New Roman" w:cs="Times New Roman"/>
+          <w:sz w:val="28"/>
+          <w:szCs w:val="28"/>
+        </w:rPr>
+      </w:pPr>
+    </w:p>
+    <w:p>
+      <w:pPr>
+        <w:autoSpaceDE w:val="0"/>
+        <w:autoSpaceDN w:val="0"/>
+        <w:adjustRightInd w:val="0"/>
+        <w:spacing w:after="0" w:line="240" w:lineRule="auto"/>
+        <w:rPr>
+          <w:rFonts w:ascii="Cascadia Mono" w:hAnsi="Cascadia Mono" w:cs="Cascadia Mono"/>
+          <w:color w:val="000000"/>
+          <w:sz w:val="19"/>
+          <w:szCs w:val="19"/>
+          <w:highlight w:val="white"/>
+        </w:rPr>
+      </w:pPr>
+      <w:r>
+        <w:rPr>
+          <w:rFonts w:ascii="Times New Roman" w:hAnsi="Times New Roman" w:cs="Times New Roman"/>
+          <w:sz w:val="28"/>
+          <w:szCs w:val="28"/>
+        </w:rPr>
+        <w:lastRenderedPageBreak/>
+        <w:drawing>
+          <wp:inline distT="0" distB="0" distL="0" distR="0" wp14:anchorId="7E938726" wp14:editId="7CB4B01E">
+            <wp:extent cx="2730033" cy="2308860"/>
+            <wp:effectExtent l="0" t="0" r="0" b="0"/>
+            <wp:docPr id="11" name="Picture 11"/>
+            <wp:cNvGraphicFramePr>
+              <a:graphicFrameLocks xmlns:a="http://schemas.openxmlformats.org/drawingml/2006/main" noChangeAspect="1"/>
+            </wp:cNvGraphicFramePr>
+            <a:graphic xmlns:a="http://schemas.openxmlformats.org/drawingml/2006/main">
+              <a:graphicData uri="http://schemas.openxmlformats.org/drawingml/2006/picture">
+                <pic:pic xmlns:pic="http://schemas.openxmlformats.org/drawingml/2006/picture">
+                  <pic:nvPicPr>
+                    <pic:cNvPr id="0" name=""/>
+                    <pic:cNvPicPr/>
+                  </pic:nvPicPr>
+                  <pic:blipFill>
+                    <a:blip r:embed="rId39"/>
+                    <a:stretch>
+                      <a:fillRect/>
+                    </a:stretch>
+                  </pic:blipFill>
+                  <pic:spPr>
+                    <a:xfrm>
+                      <a:off x="0" y="0"/>
+                      <a:ext cx="2730579" cy="2309322"/>
+                    </a:xfrm>
+                    <a:prstGeom prst="rect">
+                      <a:avLst/>
+                    </a:prstGeom>
+                  </pic:spPr>
+                </pic:pic>
+              </a:graphicData>
+            </a:graphic>
+          </wp:inline>
+        </w:drawing>
+      </w:r>
+      <w:r>
+        <w:rPr>
+          <w:rFonts w:ascii="Cascadia Mono" w:hAnsi="Cascadia Mono" w:cs="Cascadia Mono"/>
+          <w:color w:val="000000"/>
+          <w:sz w:val="19"/>
+          <w:szCs w:val="19"/>
+          <w:highlight w:val="white"/>
+        </w:rPr>
+        <w:t xml:space="preserve">        [</w:t>
+      </w:r>
+      <w:proofErr w:type="gramStart"/>
+      <w:r>
+        <w:rPr>
+          <w:rFonts w:ascii="Cascadia Mono" w:hAnsi="Cascadia Mono" w:cs="Cascadia Mono"/>
+          <w:color w:val="2B91AF"/>
+          <w:sz w:val="19"/>
+          <w:szCs w:val="19"/>
+          <w:highlight w:val="white"/>
+        </w:rPr>
+        <w:t>Display</w:t>
+      </w:r>
+      <w:r>
+        <w:rPr>
+          <w:rFonts w:ascii="Cascadia Mono" w:hAnsi="Cascadia Mono" w:cs="Cascadia Mono"/>
+          <w:color w:val="000000"/>
+          <w:sz w:val="19"/>
+          <w:szCs w:val="19"/>
+          <w:highlight w:val="white"/>
+        </w:rPr>
+        <w:t>(</w:t>
+      </w:r>
+      <w:proofErr w:type="gramEnd"/>
+      <w:r>
+        <w:rPr>
+          <w:rFonts w:ascii="Cascadia Mono" w:hAnsi="Cascadia Mono" w:cs="Cascadia Mono"/>
+          <w:color w:val="000000"/>
+          <w:sz w:val="19"/>
+          <w:szCs w:val="19"/>
+          <w:highlight w:val="white"/>
+        </w:rPr>
+        <w:t xml:space="preserve">Name = </w:t>
+      </w:r>
+      <w:r>
+        <w:rPr>
+          <w:rFonts w:ascii="Cascadia Mono" w:hAnsi="Cascadia Mono" w:cs="Cascadia Mono"/>
+          <w:color w:val="A31515"/>
+          <w:sz w:val="19"/>
+          <w:szCs w:val="19"/>
+          <w:highlight w:val="white"/>
+        </w:rPr>
+        <w:t>"Upload date"</w:t>
+      </w:r>
+      <w:r>
+        <w:rPr>
+          <w:rFonts w:ascii="Cascadia Mono" w:hAnsi="Cascadia Mono" w:cs="Cascadia Mono"/>
+          <w:color w:val="000000"/>
+          <w:sz w:val="19"/>
+          <w:szCs w:val="19"/>
+          <w:highlight w:val="white"/>
+        </w:rPr>
+        <w:t>)]</w:t>
+      </w:r>
+    </w:p>
+    <w:p>
+      <w:pPr>
+        <w:autoSpaceDE w:val="0"/>
+        <w:autoSpaceDN w:val="0"/>
+        <w:adjustRightInd w:val="0"/>
+        <w:spacing w:after="0" w:line="240" w:lineRule="auto"/>
+        <w:rPr>
+          <w:rFonts w:ascii="Cascadia Mono" w:hAnsi="Cascadia Mono" w:cs="Cascadia Mono"/>
+          <w:color w:val="000000"/>
+          <w:sz w:val="19"/>
+          <w:szCs w:val="19"/>
+          <w:highlight w:val="white"/>
+        </w:rPr>
+      </w:pPr>
+      <w:r>
+        <w:rPr>
+          <w:rFonts w:ascii="Cascadia Mono" w:hAnsi="Cascadia Mono" w:cs="Cascadia Mono"/>
+          <w:color w:val="000000"/>
+          <w:sz w:val="19"/>
+          <w:szCs w:val="19"/>
+          <w:highlight w:val="white"/>
+        </w:rPr>
+        <w:t xml:space="preserve">        [</w:t>
+      </w:r>
+      <w:proofErr w:type="gramStart"/>
+      <w:r>
+        <w:rPr>
+          <w:rFonts w:ascii="Cascadia Mono" w:hAnsi="Cascadia Mono" w:cs="Cascadia Mono"/>
+          <w:color w:val="2B91AF"/>
+          <w:sz w:val="19"/>
+          <w:szCs w:val="19"/>
+          <w:highlight w:val="white"/>
+        </w:rPr>
+        <w:t>DataType</w:t>
+      </w:r>
+      <w:r>
+        <w:rPr>
+          <w:rFonts w:ascii="Cascadia Mono" w:hAnsi="Cascadia Mono" w:cs="Cascadia Mono"/>
+          <w:color w:val="000000"/>
+          <w:sz w:val="19"/>
+          <w:szCs w:val="19"/>
+          <w:highlight w:val="white"/>
+        </w:rPr>
+        <w:t>(</w:t>
+      </w:r>
+      <w:proofErr w:type="gramEnd"/>
+      <w:r>
+        <w:rPr>
+          <w:rFonts w:ascii="Cascadia Mono" w:hAnsi="Cascadia Mono" w:cs="Cascadia Mono"/>
+          <w:color w:val="2B91AF"/>
+          <w:sz w:val="19"/>
+          <w:szCs w:val="19"/>
+          <w:highlight w:val="white"/>
+        </w:rPr>
+        <w:t>DataType</w:t>
+      </w:r>
+      <w:r>
+        <w:rPr>
+          <w:rFonts w:ascii="Cascadia Mono" w:hAnsi="Cascadia Mono" w:cs="Cascadia Mono"/>
+          <w:color w:val="000000"/>
+          <w:sz w:val="19"/>
+          <w:szCs w:val="19"/>
+          <w:highlight w:val="white"/>
+        </w:rPr>
+        <w:t>.Date)]</w:t>
+      </w:r>
+    </w:p>
+    <w:p>
+      <w:pPr>
+        <w:autoSpaceDE w:val="0"/>
+        <w:autoSpaceDN w:val="0"/>
+        <w:adjustRightInd w:val="0"/>
+        <w:spacing w:after="0" w:line="240" w:lineRule="auto"/>
+        <w:rPr>
+          <w:rFonts w:ascii="Cascadia Mono" w:hAnsi="Cascadia Mono" w:cs="Cascadia Mono"/>
+          <w:color w:val="000000"/>
+          <w:sz w:val="19"/>
+          <w:szCs w:val="19"/>
+          <w:highlight w:val="white"/>
+        </w:rPr>
+      </w:pPr>
+      <w:r>
+        <w:rPr>
+          <w:rFonts w:ascii="Cascadia Mono" w:hAnsi="Cascadia Mono" w:cs="Cascadia Mono"/>
+          <w:color w:val="000000"/>
+          <w:sz w:val="19"/>
+          <w:szCs w:val="19"/>
+          <w:highlight w:val="white"/>
+        </w:rPr>
+        <w:t xml:space="preserve">        [</w:t>
+      </w:r>
+      <w:proofErr w:type="gramStart"/>
+      <w:r>
+        <w:rPr>
+          <w:rFonts w:ascii="Cascadia Mono" w:hAnsi="Cascadia Mono" w:cs="Cascadia Mono"/>
+          <w:color w:val="2B91AF"/>
+          <w:sz w:val="19"/>
+          <w:szCs w:val="19"/>
+          <w:highlight w:val="white"/>
+        </w:rPr>
+        <w:t>Range</w:t>
+      </w:r>
+      <w:r>
+        <w:rPr>
+          <w:rFonts w:ascii="Cascadia Mono" w:hAnsi="Cascadia Mono" w:cs="Cascadia Mono"/>
+          <w:color w:val="000000"/>
+          <w:sz w:val="19"/>
+          <w:szCs w:val="19"/>
+          <w:highlight w:val="white"/>
+        </w:rPr>
+        <w:t>(</w:t>
+      </w:r>
+      <w:proofErr w:type="gramEnd"/>
+      <w:r>
+        <w:rPr>
+          <w:rFonts w:ascii="Cascadia Mono" w:hAnsi="Cascadia Mono" w:cs="Cascadia Mono"/>
+          <w:color w:val="0000FF"/>
+          <w:sz w:val="19"/>
+          <w:szCs w:val="19"/>
+          <w:highlight w:val="white"/>
+        </w:rPr>
+        <w:t>typeof</w:t>
+      </w:r>
+      <w:r>
+        <w:rPr>
+          <w:rFonts w:ascii="Cascadia Mono" w:hAnsi="Cascadia Mono" w:cs="Cascadia Mono"/>
+          <w:color w:val="000000"/>
+          <w:sz w:val="19"/>
+          <w:szCs w:val="19"/>
+          <w:highlight w:val="white"/>
+        </w:rPr>
+        <w:t>(</w:t>
+      </w:r>
+      <w:r>
+        <w:rPr>
+          <w:rFonts w:ascii="Cascadia Mono" w:hAnsi="Cascadia Mono" w:cs="Cascadia Mono"/>
+          <w:color w:val="2B91AF"/>
+          <w:sz w:val="19"/>
+          <w:szCs w:val="19"/>
+          <w:highlight w:val="white"/>
+        </w:rPr>
+        <w:t>DateTime</w:t>
+      </w:r>
+      <w:r>
+        <w:rPr>
+          <w:rFonts w:ascii="Cascadia Mono" w:hAnsi="Cascadia Mono" w:cs="Cascadia Mono"/>
+          <w:color w:val="000000"/>
+          <w:sz w:val="19"/>
+          <w:szCs w:val="19"/>
+          <w:highlight w:val="white"/>
+        </w:rPr>
+        <w:t xml:space="preserve">), </w:t>
+      </w:r>
+      <w:r>
+        <w:rPr>
+          <w:rFonts w:ascii="Cascadia Mono" w:hAnsi="Cascadia Mono" w:cs="Cascadia Mono"/>
+          <w:color w:val="A31515"/>
+          <w:sz w:val="19"/>
+          <w:szCs w:val="19"/>
+          <w:highlight w:val="white"/>
+        </w:rPr>
+        <w:t>"2014-01-01"</w:t>
+      </w:r>
+      <w:r>
+        <w:rPr>
+          <w:rFonts w:ascii="Cascadia Mono" w:hAnsi="Cascadia Mono" w:cs="Cascadia Mono"/>
+          <w:color w:val="000000"/>
+          <w:sz w:val="19"/>
+          <w:szCs w:val="19"/>
+          <w:highlight w:val="white"/>
+        </w:rPr>
+        <w:t xml:space="preserve">, </w:t>
+      </w:r>
+      <w:r>
+        <w:rPr>
+          <w:rFonts w:ascii="Cascadia Mono" w:hAnsi="Cascadia Mono" w:cs="Cascadia Mono"/>
+          <w:color w:val="A31515"/>
+          <w:sz w:val="19"/>
+          <w:szCs w:val="19"/>
+          <w:highlight w:val="white"/>
+        </w:rPr>
+        <w:t>"2026-12-31"</w:t>
+      </w:r>
+      <w:r>
+        <w:rPr>
+          <w:rFonts w:ascii="Cascadia Mono" w:hAnsi="Cascadia Mono" w:cs="Cascadia Mono"/>
+          <w:color w:val="000000"/>
+          <w:sz w:val="19"/>
+          <w:szCs w:val="19"/>
+          <w:highlight w:val="white"/>
+        </w:rPr>
+        <w:t xml:space="preserve">, ErrorMessage = </w:t>
+      </w:r>
+      <w:r>
+        <w:rPr>
+          <w:rFonts w:ascii="Cascadia Mono" w:hAnsi="Cascadia Mono" w:cs="Cascadia Mono"/>
+          <w:color w:val="A31515"/>
+          <w:sz w:val="19"/>
+          <w:szCs w:val="19"/>
+          <w:highlight w:val="white"/>
+        </w:rPr>
+        <w:t>"Date out of bounds"</w:t>
+      </w:r>
+      <w:r>
+        <w:rPr>
+          <w:rFonts w:ascii="Cascadia Mono" w:hAnsi="Cascadia Mono" w:cs="Cascadia Mono"/>
+          <w:color w:val="000000"/>
+          <w:sz w:val="19"/>
+          <w:szCs w:val="19"/>
+          <w:highlight w:val="white"/>
+        </w:rPr>
+        <w:t>)]</w:t>
+      </w:r>
+    </w:p>
+    <w:p>
+      <w:pPr>
+        <w:autoSpaceDE w:val="0"/>
+        <w:autoSpaceDN w:val="0"/>
+        <w:adjustRightInd w:val="0"/>
+        <w:spacing w:after="0" w:line="240" w:lineRule="auto"/>
+        <w:rPr>
+          <w:rFonts w:ascii="Cascadia Mono" w:hAnsi="Cascadia Mono" w:cs="Cascadia Mono"/>
+          <w:color w:val="000000"/>
+          <w:sz w:val="19"/>
+          <w:szCs w:val="19"/>
+          <w:highlight w:val="white"/>
+        </w:rPr>
+      </w:pPr>
+      <w:r>
+        <w:rPr>
+          <w:rFonts w:ascii="Cascadia Mono" w:hAnsi="Cascadia Mono" w:cs="Cascadia Mono"/>
+          <w:color w:val="000000"/>
+          <w:sz w:val="19"/>
+          <w:szCs w:val="19"/>
+          <w:highlight w:val="white"/>
+        </w:rPr>
+        <w:t xml:space="preserve">        [</w:t>
+      </w:r>
+      <w:proofErr w:type="gramStart"/>
+      <w:r>
+        <w:rPr>
+          <w:rFonts w:ascii="Cascadia Mono" w:hAnsi="Cascadia Mono" w:cs="Cascadia Mono"/>
+          <w:color w:val="2B91AF"/>
+          <w:sz w:val="19"/>
+          <w:szCs w:val="19"/>
+          <w:highlight w:val="white"/>
+        </w:rPr>
+        <w:t>Required</w:t>
+      </w:r>
+      <w:r>
+        <w:rPr>
+          <w:rFonts w:ascii="Cascadia Mono" w:hAnsi="Cascadia Mono" w:cs="Cascadia Mono"/>
+          <w:color w:val="000000"/>
+          <w:sz w:val="19"/>
+          <w:szCs w:val="19"/>
+          <w:highlight w:val="white"/>
+        </w:rPr>
+        <w:t>(</w:t>
+      </w:r>
+      <w:proofErr w:type="gramEnd"/>
+      <w:r>
+        <w:rPr>
+          <w:rFonts w:ascii="Cascadia Mono" w:hAnsi="Cascadia Mono" w:cs="Cascadia Mono"/>
+          <w:color w:val="000000"/>
+          <w:sz w:val="19"/>
+          <w:szCs w:val="19"/>
+          <w:highlight w:val="white"/>
+        </w:rPr>
+        <w:t>)]</w:t>
+      </w:r>
+    </w:p>
+    <w:p>
+      <w:pPr>
+        <w:autoSpaceDE w:val="0"/>
+        <w:autoSpaceDN w:val="0"/>
+        <w:adjustRightInd w:val="0"/>
+        <w:spacing w:after="0" w:line="240" w:lineRule="auto"/>
+        <w:rPr>
+          <w:rFonts w:ascii="Cascadia Mono" w:hAnsi="Cascadia Mono" w:cs="Cascadia Mono"/>
+          <w:color w:val="000000"/>
+          <w:sz w:val="19"/>
+          <w:szCs w:val="19"/>
+          <w:highlight w:val="white"/>
+        </w:rPr>
+      </w:pPr>
+      <w:r>
+        <w:rPr>
+          <w:rFonts w:ascii="Cascadia Mono" w:hAnsi="Cascadia Mono" w:cs="Cascadia Mono"/>
+          <w:color w:val="000000"/>
+          <w:sz w:val="19"/>
+          <w:szCs w:val="19"/>
+          <w:highlight w:val="white"/>
+        </w:rPr>
+        <w:t xml:space="preserve">        </w:t>
+      </w:r>
+      <w:proofErr w:type="gramStart"/>
+      <w:r>
+        <w:rPr>
+          <w:rFonts w:ascii="Cascadia Mono" w:hAnsi="Cascadia Mono" w:cs="Cascadia Mono"/>
+          <w:color w:val="0000FF"/>
+          <w:sz w:val="19"/>
+          <w:szCs w:val="19"/>
+          <w:highlight w:val="white"/>
+        </w:rPr>
+        <w:t>public</w:t>
+      </w:r>
+      <w:proofErr w:type="gramEnd"/>
+      <w:r>
+        <w:rPr>
+          <w:rFonts w:ascii="Cascadia Mono" w:hAnsi="Cascadia Mono" w:cs="Cascadia Mono"/>
+          <w:color w:val="000000"/>
+          <w:sz w:val="19"/>
+          <w:szCs w:val="19"/>
+          <w:highlight w:val="white"/>
+        </w:rPr>
+        <w:t xml:space="preserve"> </w:t>
+      </w:r>
+      <w:r>
+        <w:rPr>
+          <w:rFonts w:ascii="Cascadia Mono" w:hAnsi="Cascadia Mono" w:cs="Cascadia Mono"/>
+          <w:color w:val="2B91AF"/>
+          <w:sz w:val="19"/>
+          <w:szCs w:val="19"/>
+          <w:highlight w:val="white"/>
+        </w:rPr>
+        <w:t>DateTime</w:t>
+      </w:r>
+      <w:r>
+        <w:rPr>
+          <w:rFonts w:ascii="Cascadia Mono" w:hAnsi="Cascadia Mono" w:cs="Cascadia Mono"/>
+          <w:color w:val="000000"/>
+          <w:sz w:val="19"/>
+          <w:szCs w:val="19"/>
+          <w:highlight w:val="white"/>
+        </w:rPr>
+        <w:t xml:space="preserve"> ImportDate { </w:t>
+      </w:r>
+      <w:r>
+        <w:rPr>
+          <w:rFonts w:ascii="Cascadia Mono" w:hAnsi="Cascadia Mono" w:cs="Cascadia Mono"/>
+          <w:color w:val="0000FF"/>
+          <w:sz w:val="19"/>
+          <w:szCs w:val="19"/>
+          <w:highlight w:val="white"/>
+        </w:rPr>
+        <w:t>get</w:t>
+      </w:r>
+      <w:r>
+        <w:rPr>
+          <w:rFonts w:ascii="Cascadia Mono" w:hAnsi="Cascadia Mono" w:cs="Cascadia Mono"/>
+          <w:color w:val="000000"/>
+          <w:sz w:val="19"/>
+          <w:szCs w:val="19"/>
+          <w:highlight w:val="white"/>
+        </w:rPr>
+        <w:t xml:space="preserve">; </w:t>
+      </w:r>
+      <w:r>
+        <w:rPr>
+          <w:rFonts w:ascii="Cascadia Mono" w:hAnsi="Cascadia Mono" w:cs="Cascadia Mono"/>
+          <w:color w:val="0000FF"/>
+          <w:sz w:val="19"/>
+          <w:szCs w:val="19"/>
+          <w:highlight w:val="white"/>
+        </w:rPr>
+        <w:t>set</w:t>
+      </w:r>
+      <w:r>
+        <w:rPr>
+          <w:rFonts w:ascii="Cascadia Mono" w:hAnsi="Cascadia Mono" w:cs="Cascadia Mono"/>
+          <w:color w:val="000000"/>
+          <w:sz w:val="19"/>
+          <w:szCs w:val="19"/>
+          <w:highlight w:val="white"/>
+        </w:rPr>
+        <w:t xml:space="preserve">; } = </w:t>
+      </w:r>
+      <w:r>
+        <w:rPr>
+          <w:rFonts w:ascii="Cascadia Mono" w:hAnsi="Cascadia Mono" w:cs="Cascadia Mono"/>
+          <w:color w:val="2B91AF"/>
+          <w:sz w:val="19"/>
+          <w:szCs w:val="19"/>
+          <w:highlight w:val="white"/>
+        </w:rPr>
+        <w:t>DateTime</w:t>
+      </w:r>
+      <w:r>
+        <w:rPr>
+          <w:rFonts w:ascii="Cascadia Mono" w:hAnsi="Cascadia Mono" w:cs="Cascadia Mono"/>
+          <w:color w:val="000000"/>
+          <w:sz w:val="19"/>
+          <w:szCs w:val="19"/>
+          <w:highlight w:val="white"/>
+        </w:rPr>
+        <w:t>.Now;</w:t>
+      </w:r>
+    </w:p>
+    <w:p>
+      <w:pPr>
+        <w:autoSpaceDE w:val="0"/>
+        <w:autoSpaceDN w:val="0"/>
+        <w:adjustRightInd w:val="0"/>
+        <w:spacing w:after="0" w:line="240" w:lineRule="auto"/>
+        <w:rPr>
+          <w:rFonts w:ascii="Times New Roman" w:hAnsi="Times New Roman" w:cs="Times New Roman"/>
+          <w:sz w:val="28"/>
+          <w:szCs w:val="28"/>
+        </w:rPr>
+      </w:pPr>
+    </w:p>
+    <w:p>
+      <w:pPr>
+        <w:autoSpaceDE w:val="0"/>
+        <w:autoSpaceDN w:val="0"/>
+        <w:adjustRightInd w:val="0"/>
+        <w:spacing w:after="0" w:line="240" w:lineRule="auto"/>
+        <w:rPr>
+          <w:rFonts w:ascii="Times New Roman" w:hAnsi="Times New Roman" w:cs="Times New Roman"/>
+          <w:sz w:val="28"/>
+          <w:szCs w:val="28"/>
+          <w:lang w:val="de-DE"/>
+        </w:rPr>
+      </w:pPr>
+      <w:r>
+        <w:rPr>
+          <w:rFonts w:ascii="Times New Roman" w:hAnsi="Times New Roman" w:cs="Times New Roman"/>
+          <w:sz w:val="28"/>
+          <w:szCs w:val="28"/>
+          <w:lang w:val="de-DE"/>
+        </w:rPr>
+        <w:t>Valori de zero in d</w:t>
+      </w:r>
+      <w:r>
+        <w:rPr>
+          <w:rFonts w:ascii="Times New Roman" w:hAnsi="Times New Roman" w:cs="Times New Roman"/>
+          <w:sz w:val="28"/>
+          <w:szCs w:val="28"/>
+          <w:lang w:val="de-DE"/>
+        </w:rPr>
+        <w:t>ash</w:t>
+      </w:r>
+    </w:p>
+    <w:p>
+      <w:pPr>
+        <w:autoSpaceDE w:val="0"/>
+        <w:autoSpaceDN w:val="0"/>
+        <w:adjustRightInd w:val="0"/>
+        <w:spacing w:after="0" w:line="240" w:lineRule="auto"/>
+        <w:rPr>
+          <w:rFonts w:ascii="Times New Roman" w:hAnsi="Times New Roman" w:cs="Times New Roman"/>
+          <w:sz w:val="28"/>
+          <w:szCs w:val="28"/>
+          <w:lang w:val="de-DE"/>
+        </w:rPr>
+      </w:pPr>
+    </w:p>
+    <w:p>
+      <w:pPr>
+        <w:autoSpaceDE w:val="0"/>
+        <w:autoSpaceDN w:val="0"/>
+        <w:adjustRightInd w:val="0"/>
+        <w:spacing w:after="0" w:line="240" w:lineRule="auto"/>
+        <w:rPr>
+          <w:rFonts w:ascii="Times New Roman" w:hAnsi="Times New Roman" w:cs="Times New Roman"/>
+          <w:sz w:val="28"/>
+          <w:szCs w:val="28"/>
+          <w:lang w:val="de-DE"/>
+        </w:rPr>
+      </w:pPr>
+    </w:p>
+    <w:p>
+      <w:pPr>
+        <w:autoSpaceDE w:val="0"/>
+        <w:autoSpaceDN w:val="0"/>
+        <w:adjustRightInd w:val="0"/>
+        <w:spacing w:after="0" w:line="240" w:lineRule="auto"/>
+        <w:rPr>
+          <w:rFonts w:ascii="Cascadia Mono" w:hAnsi="Cascadia Mono" w:cs="Cascadia Mono"/>
+          <w:color w:val="000000"/>
+          <w:sz w:val="19"/>
+          <w:szCs w:val="19"/>
+          <w:highlight w:val="white"/>
+        </w:rPr>
+      </w:pPr>
+      <w:r>
+        <w:rPr>
+          <w:rFonts w:ascii="Times New Roman" w:hAnsi="Times New Roman" w:cs="Times New Roman"/>
+          <w:sz w:val="28"/>
+          <w:szCs w:val="28"/>
+        </w:rPr>
+        <w:t xml:space="preserve">Scos </w:t>
+      </w:r>
+      <w:r>
+        <w:rPr>
+          <w:rFonts w:ascii="Cascadia Mono" w:hAnsi="Cascadia Mono" w:cs="Cascadia Mono"/>
+          <w:color w:val="000000"/>
+          <w:sz w:val="19"/>
+          <w:szCs w:val="19"/>
+          <w:highlight w:val="white"/>
+        </w:rPr>
+        <w:t xml:space="preserve">        [</w:t>
+      </w:r>
+      <w:proofErr w:type="gramStart"/>
+      <w:r>
+        <w:rPr>
+          <w:rFonts w:ascii="Cascadia Mono" w:hAnsi="Cascadia Mono" w:cs="Cascadia Mono"/>
+          <w:color w:val="2B91AF"/>
+          <w:sz w:val="19"/>
+          <w:szCs w:val="19"/>
+          <w:highlight w:val="white"/>
+        </w:rPr>
+        <w:t>Range</w:t>
+      </w:r>
+      <w:r>
+        <w:rPr>
+          <w:rFonts w:ascii="Cascadia Mono" w:hAnsi="Cascadia Mono" w:cs="Cascadia Mono"/>
+          <w:color w:val="000000"/>
+          <w:sz w:val="19"/>
+          <w:szCs w:val="19"/>
+          <w:highlight w:val="white"/>
+        </w:rPr>
+        <w:t>(</w:t>
+      </w:r>
+      <w:proofErr w:type="gramEnd"/>
+      <w:r>
+        <w:rPr>
+          <w:rFonts w:ascii="Cascadia Mono" w:hAnsi="Cascadia Mono" w:cs="Cascadia Mono"/>
+          <w:color w:val="0000FF"/>
+          <w:sz w:val="19"/>
+          <w:szCs w:val="19"/>
+          <w:highlight w:val="white"/>
+        </w:rPr>
+        <w:t>typeof</w:t>
+      </w:r>
+      <w:r>
+        <w:rPr>
+          <w:rFonts w:ascii="Cascadia Mono" w:hAnsi="Cascadia Mono" w:cs="Cascadia Mono"/>
+          <w:color w:val="000000"/>
+          <w:sz w:val="19"/>
+          <w:szCs w:val="19"/>
+          <w:highlight w:val="white"/>
+        </w:rPr>
+        <w:t>(</w:t>
+      </w:r>
+      <w:r>
+        <w:rPr>
+          <w:rFonts w:ascii="Cascadia Mono" w:hAnsi="Cascadia Mono" w:cs="Cascadia Mono"/>
+          <w:color w:val="0000FF"/>
+          <w:sz w:val="19"/>
+          <w:szCs w:val="19"/>
+          <w:highlight w:val="white"/>
+        </w:rPr>
+        <w:t>decimal</w:t>
+      </w:r>
+      <w:r>
+        <w:rPr>
+          <w:rFonts w:ascii="Cascadia Mono" w:hAnsi="Cascadia Mono" w:cs="Cascadia Mono"/>
+          <w:color w:val="000000"/>
+          <w:sz w:val="19"/>
+          <w:szCs w:val="19"/>
+          <w:highlight w:val="white"/>
+        </w:rPr>
+        <w:t xml:space="preserve">), </w:t>
+      </w:r>
+      <w:r>
+        <w:rPr>
+          <w:rFonts w:ascii="Cascadia Mono" w:hAnsi="Cascadia Mono" w:cs="Cascadia Mono"/>
+          <w:color w:val="A31515"/>
+          <w:sz w:val="19"/>
+          <w:szCs w:val="19"/>
+          <w:highlight w:val="white"/>
+        </w:rPr>
+        <w:t>"0"</w:t>
+      </w:r>
+      <w:r>
+        <w:rPr>
+          <w:rFonts w:ascii="Cascadia Mono" w:hAnsi="Cascadia Mono" w:cs="Cascadia Mono"/>
+          <w:color w:val="000000"/>
+          <w:sz w:val="19"/>
+          <w:szCs w:val="19"/>
+          <w:highlight w:val="white"/>
+        </w:rPr>
+        <w:t xml:space="preserve">, </w:t>
+      </w:r>
+      <w:r>
+        <w:rPr>
+          <w:rFonts w:ascii="Cascadia Mono" w:hAnsi="Cascadia Mono" w:cs="Cascadia Mono"/>
+          <w:color w:val="A31515"/>
+          <w:sz w:val="19"/>
+          <w:szCs w:val="19"/>
+          <w:highlight w:val="white"/>
+        </w:rPr>
+        <w:t>"9999999999"</w:t>
+      </w:r>
+      <w:r>
+        <w:rPr>
+          <w:rFonts w:ascii="Cascadia Mono" w:hAnsi="Cascadia Mono" w:cs="Cascadia Mono"/>
+          <w:color w:val="000000"/>
+          <w:sz w:val="19"/>
+          <w:szCs w:val="19"/>
+          <w:highlight w:val="white"/>
+        </w:rPr>
+        <w:t>)]</w:t>
+      </w:r>
+    </w:p>
+    <w:p>
+      <w:pPr>
+        <w:autoSpaceDE w:val="0"/>
+        <w:autoSpaceDN w:val="0"/>
+        <w:adjustRightInd w:val="0"/>
+        <w:spacing w:after="0" w:line="240" w:lineRule="auto"/>
+        <w:rPr>
+          <w:rFonts w:ascii="Times New Roman" w:hAnsi="Times New Roman" w:cs="Times New Roman"/>
+          <w:sz w:val="28"/>
+          <w:szCs w:val="28"/>
+        </w:rPr>
+      </w:pPr>
+      <w:r>
+        <w:rPr>
+          <w:rFonts w:ascii="Times New Roman" w:hAnsi="Times New Roman" w:cs="Times New Roman"/>
+          <w:sz w:val="28"/>
+          <w:szCs w:val="28"/>
+        </w:rPr>
+        <w:t>D</w:t>
+      </w:r>
+      <w:r>
+        <w:rPr>
+          <w:rFonts w:ascii="Times New Roman" w:hAnsi="Times New Roman" w:cs="Times New Roman"/>
+          <w:sz w:val="28"/>
+          <w:szCs w:val="28"/>
+        </w:rPr>
+        <w:t>in model YFR, sunt citite din csv anyway</w:t>
+      </w:r>
+    </w:p>
+    <w:p>
+      <w:pPr>
+        <w:autoSpaceDE w:val="0"/>
+        <w:autoSpaceDN w:val="0"/>
+        <w:adjustRightInd w:val="0"/>
+        <w:spacing w:after="0" w:line="240" w:lineRule="auto"/>
+        <w:rPr>
+          <w:rFonts w:ascii="Times New Roman" w:hAnsi="Times New Roman" w:cs="Times New Roman"/>
+          <w:sz w:val="28"/>
+          <w:szCs w:val="28"/>
+        </w:rPr>
+      </w:pPr>
+    </w:p>
+    <w:p>
+      <w:pPr>
+        <w:autoSpaceDE w:val="0"/>
+        <w:autoSpaceDN w:val="0"/>
+        <w:adjustRightInd w:val="0"/>
+        <w:spacing w:after="0" w:line="240" w:lineRule="auto"/>
+        <w:rPr>
+          <w:rFonts w:ascii="Times New Roman" w:hAnsi="Times New Roman" w:cs="Times New Roman"/>
+          <w:sz w:val="28"/>
+          <w:szCs w:val="28"/>
+        </w:rPr>
+      </w:pPr>
+      <w:r>
+        <w:rPr>
+          <w:rFonts w:ascii="Times New Roman" w:hAnsi="Times New Roman" w:cs="Times New Roman"/>
+          <w:sz w:val="28"/>
+          <w:szCs w:val="28"/>
+        </w:rPr>
+        <w:t xml:space="preserve">PE MAINE </w:t>
+      </w:r>
+    </w:p>
+    <w:p>
+      <w:pPr>
+        <w:autoSpaceDE w:val="0"/>
+        <w:autoSpaceDN w:val="0"/>
+        <w:adjustRightInd w:val="0"/>
+        <w:spacing w:after="0" w:line="240" w:lineRule="auto"/>
+        <w:rPr>
+          <w:rFonts w:ascii="Times New Roman" w:hAnsi="Times New Roman" w:cs="Times New Roman"/>
+          <w:sz w:val="28"/>
+          <w:szCs w:val="28"/>
+        </w:rPr>
+      </w:pPr>
+      <w:r>
+        <w:rPr>
+          <w:rFonts w:ascii="Times New Roman" w:hAnsi="Times New Roman" w:cs="Times New Roman"/>
+          <w:sz w:val="28"/>
+          <w:szCs w:val="28"/>
+        </w:rPr>
+        <w:t>NORMALIZAT ID URI VARIABILE UNELE SUNT CU LITERA MARE ALTELE MICA</w:t>
+      </w:r>
+    </w:p>
+    <w:p>
+      <w:pPr>
+        <w:autoSpaceDE w:val="0"/>
+        <w:autoSpaceDN w:val="0"/>
+        <w:adjustRightInd w:val="0"/>
+        <w:spacing w:after="0" w:line="240" w:lineRule="auto"/>
+        <w:rPr>
+          <w:rFonts w:ascii="Times New Roman" w:hAnsi="Times New Roman" w:cs="Times New Roman"/>
+          <w:sz w:val="28"/>
+          <w:szCs w:val="28"/>
+        </w:rPr>
+      </w:pPr>
+      <w:r>
+        <w:rPr>
+          <w:rFonts w:ascii="Times New Roman" w:hAnsi="Times New Roman" w:cs="Times New Roman"/>
+          <w:sz w:val="28"/>
+          <w:szCs w:val="28"/>
+        </w:rPr>
+        <w:t>DASHBOARD</w:t>
+      </w:r>
+      <w:r>
+        <w:rPr>
+          <w:rFonts w:ascii="Times New Roman" w:hAnsi="Times New Roman" w:cs="Times New Roman"/>
+          <w:sz w:val="28"/>
+          <w:szCs w:val="28"/>
+        </w:rPr>
+        <w:t xml:space="preserve"> CU VALORI NEGATIVE NE INCLUSE</w:t>
+      </w:r>
+    </w:p>
+    <w:p>
+      <w:pPr>
+        <w:autoSpaceDE w:val="0"/>
+        <w:autoSpaceDN w:val="0"/>
+        <w:adjustRightInd w:val="0"/>
+        <w:spacing w:after="0" w:line="240" w:lineRule="auto"/>
+        <w:rPr>
+          <w:rFonts w:ascii="Times New Roman" w:hAnsi="Times New Roman" w:cs="Times New Roman"/>
+          <w:sz w:val="28"/>
+          <w:szCs w:val="28"/>
+        </w:rPr>
+      </w:pPr>
+      <w:proofErr w:type="gramStart"/>
+      <w:r>
+        <w:rPr>
+          <w:rFonts w:ascii="Cascadia Mono" w:hAnsi="Cascadia Mono" w:cs="Cascadia Mono"/>
+          <w:color w:val="008000"/>
+          <w:sz w:val="19"/>
+          <w:szCs w:val="19"/>
+          <w:highlight w:val="white"/>
+        </w:rPr>
+        <w:t>//adaugat int?</w:t>
+      </w:r>
+      <w:proofErr w:type="gramEnd"/>
+      <w:r>
+        <w:rPr>
+          <w:rFonts w:ascii="Cascadia Mono" w:hAnsi="Cascadia Mono" w:cs="Cascadia Mono"/>
+          <w:color w:val="008000"/>
+          <w:sz w:val="19"/>
+          <w:szCs w:val="19"/>
+          <w:highlight w:val="white"/>
+        </w:rPr>
+        <w:t xml:space="preserve"> companyId,  inainte gol</w:t>
+      </w:r>
+      <w:bookmarkStart w:id="0" w:name="_GoBack"/>
+      <w:bookmarkEnd w:id="0"/>
+      <w:r>
+        <w:rPr>
+          <w:rFonts w:ascii="Times New Roman" w:hAnsi="Times New Roman" w:cs="Times New Roman"/>
+          <w:sz w:val="28"/>
+          <w:szCs w:val="28"/>
+        </w:rPr>
+        <w:t xml:space="preserve"> </w:t>
+      </w:r>
     </w:p>
     <w:sectPr>
       <w:pgSz w:w="11906" w:h="16838"/>
@@ -19530,6 +21179,16 @@
     <w:basedOn w:val="DefaultParagraphFont"/>
     <w:rsid w:val="001E77C8"/>
   </w:style>
+  <w:style w:type="character" w:customStyle="1" w:styleId="hljs-comment">
+    <w:name w:val="hljs-comment"/>
+    <w:basedOn w:val="DefaultParagraphFont"/>
+    <w:rsid w:val="00C964E2"/>
+  </w:style>
+  <w:style w:type="character" w:customStyle="1" w:styleId="hljs-keyword">
+    <w:name w:val="hljs-keyword"/>
+    <w:basedOn w:val="DefaultParagraphFont"/>
+    <w:rsid w:val="00C964E2"/>
+  </w:style>
 </w:styles>
 </file>
 
@@ -19911,6 +21570,16 @@
     <w:basedOn w:val="DefaultParagraphFont"/>
     <w:rsid w:val="001E77C8"/>
   </w:style>
+  <w:style w:type="character" w:customStyle="1" w:styleId="hljs-comment">
+    <w:name w:val="hljs-comment"/>
+    <w:basedOn w:val="DefaultParagraphFont"/>
+    <w:rsid w:val="00C964E2"/>
+  </w:style>
+  <w:style w:type="character" w:customStyle="1" w:styleId="hljs-keyword">
+    <w:name w:val="hljs-keyword"/>
+    <w:basedOn w:val="DefaultParagraphFont"/>
+    <w:rsid w:val="00C964E2"/>
+  </w:style>
 </w:styles>
 </file>
 

</xml_diff>